<commit_message>
docs: fill in progress report 4 content
</commit_message>
<xml_diff>
--- a/mapp-progress-report-4.docx
+++ b/mapp-progress-report-4.docx
@@ -1,5 +1,43 @@
 
-<file path=word/document.xml><?xml version="1.0" encoding="utf-8"?>
+<file path=docProps\app.xml><?xml version="1.0" encoding="utf-8"?>
+<Properties xmlns="http://schemas.openxmlformats.org/officeDocument/2006/extended-properties" xmlns:vt="http://schemas.openxmlformats.org/officeDocument/2006/docPropsVTypes">
+  <Words>83</Words>
+  <SharedDoc>false</SharedDoc>
+  <HyperlinksChanged>false</HyperlinksChanged>
+  <Lines>12</Lines>
+  <AppVersion>12.0000</AppVersion>
+  <LinksUpToDate>false</LinksUpToDate>
+  <Application>Microsoft Word 12.0.0</Application>
+  <CharactersWithSpaces>583</CharactersWithSpaces>
+  <Template>Normal.dotm</Template>
+  <DocSecurity>0</DocSecurity>
+  <TotalTime>6</TotalTime>
+  <ScaleCrop>false</ScaleCrop>
+  <Characters>475</Characters>
+  <Paragraphs>8</Paragraphs>
+  <Pages>1</Pages>
+</Properties>
+</file>
+
+<file path=docProps\core.xml><?xml version="1.0" encoding="utf-8"?>
+<cp:coreProperties xmlns:cp="http://schemas.openxmlformats.org/package/2006/metadata/core-properties" xmlns:dc="http://purl.org/dc/elements/1.1/" xmlns:dcterms="http://purl.org/dc/terms/" xmlns:dcmitype="http://purl.org/dc/dcmitype/" xmlns:xsi="http://www.w3.org/2001/XMLSchema-instance">
+  <dc:title/>
+  <dc:creator/>
+  <cp:keywords/>
+  <dcterms:created xsi:type="dcterms:W3CDTF">2026-10-08T03:07:28Z</dcterms:created>
+  <dcterms:modified xsi:type="dcterms:W3CDTF">2026-10-08T03:07:28Z</dcterms:modified>
+</cp:coreProperties>
+</file>
+
+<file path=docProps\custom.xml><?xml version="1.0" encoding="utf-8"?>
+<Properties xmlns="http://schemas.openxmlformats.org/officeDocument/2006/custom-properties" xmlns:vt="http://schemas.openxmlformats.org/officeDocument/2006/docPropsVTypes"/>
+</file>
+
+<file path=word\comments.xml><?xml version="1.0" encoding="utf-8"?>
+<w:comments xmlns:w="http://schemas.openxmlformats.org/wordprocessingml/2006/main" xmlns:m="http://schemas.openxmlformats.org/officeDocument/2006/math" xmlns:r="http://schemas.openxmlformats.org/officeDocument/2006/relationships" xmlns:o="urn:schemas-microsoft-com:office:office" xmlns:v="urn:schemas-microsoft-com:vml" xmlns:w10="urn:schemas-microsoft-com:office:word" xmlns:a="http://schemas.openxmlformats.org/drawingml/2006/main" xmlns:pic="http://schemas.openxmlformats.org/drawingml/2006/picture" xmlns:wp="http://schemas.openxmlformats.org/drawingml/2006/wordprocessingDrawing"/>
+</file>
+
+<file path=word\document.xml><?xml version="1.0" encoding="utf-8"?>
 <w:document xmlns:w="http://schemas.openxmlformats.org/wordprocessingml/2006/main" xmlns:m="http://schemas.openxmlformats.org/officeDocument/2006/math" xmlns:r="http://schemas.openxmlformats.org/officeDocument/2006/relationships" xmlns:o="urn:schemas-microsoft-com:office:office" xmlns:v="urn:schemas-microsoft-com:vml" xmlns:w10="urn:schemas-microsoft-com:office:word" xmlns:a="http://schemas.openxmlformats.org/drawingml/2006/main" xmlns:pic="http://schemas.openxmlformats.org/drawingml/2006/picture" xmlns:wp="http://schemas.openxmlformats.org/drawingml/2006/wordprocessingDrawing">
   <w:body>
     <w:bookmarkStart w:id="9" w:name="进度报告4第6周dart语言基础三异步异常与包管理"/>
@@ -34,16 +72,7 @@
           <w:color w:val="000000"/>
           <w:sz w:val="24"/>
         </w:rPr>
-        <w:t xml:space="preserve">使用方式：在模板上作答，作答完成后将全文复制到雨课堂答题区（图片无法粘贴时在雨课堂编辑器中手工重新上传），并将同一内容存入自己仓库</w:t>
-      </w:r>
-      <w:r>
-        <w:rPr>
-          <w:rFonts w:ascii="Times New Roman" w:hAnsi="Times New Roman" w:eastAsia="宋体" w:cs="Times New Roman"/>
-          <w:i w:val="0"/>
-          <w:color w:val="000000"/>
-          <w:sz w:val="24"/>
-        </w:rPr>
-        <w:t xml:space="preserve"> lecture4/progress.md。</w:t>
+        <w:t xml:space="preserve">使用方式：在模板上作答，作答完成后将全文复制到雨课堂答题区（图片无法粘贴时在雨课堂编辑器中手工重新上传），并将同一内容存入自己仓库 lecture4/progress.md。</w:t>
       </w:r>
     </w:p>
     <w:p>
@@ -60,178 +89,1518 @@
           <w:color w:val="000000"/>
           <w:sz w:val="24"/>
         </w:rPr>
-        <w:t xml:space="preserve">一、任务理解：用自己的话说明本次作业要完成什么、验收标准是什么。</w:t>
-      </w:r>
-    </w:p>
-    <w:p>
-      <w:pPr>
-        <w:pStyle w:val="BodyText"/>
-        <w:ind w:firstLineChars="200" w:firstLine="480"/>
-        <w:spacing w:beforeLines="50" w:afterLines="0" w:line="360" w:lineRule="auto" w:before="120" w:after="0"/>
-        <w:jc w:val="both"/>
-      </w:pPr>
-      <w:r>
-        <w:rPr>
-          <w:rFonts w:hint="eastAsia" w:ascii="Times New Roman" w:hAnsi="Times New Roman" w:eastAsia="宋体" w:cs="Times New Roman"/>
-          <w:i w:val="0"/>
-          <w:color w:val="000000"/>
-          <w:sz w:val="24"/>
-        </w:rPr>
-        <w:t xml:space="preserve">二、环境与工具：本次使用的开发环境、运行目标（Web/模拟器/真机）与AI工具版本。</w:t>
-      </w:r>
-    </w:p>
-    <w:p>
-      <w:pPr>
-        <w:pStyle w:val="BodyText"/>
-        <w:ind w:firstLineChars="200" w:firstLine="480"/>
-        <w:spacing w:beforeLines="50" w:afterLines="0" w:line="360" w:lineRule="auto" w:before="120" w:after="0"/>
-        <w:jc w:val="both"/>
-      </w:pPr>
-      <w:r>
-        <w:rPr>
-          <w:rFonts w:hint="eastAsia" w:ascii="Times New Roman" w:hAnsi="Times New Roman" w:eastAsia="宋体" w:cs="Times New Roman"/>
-          <w:i w:val="0"/>
-          <w:color w:val="000000"/>
-          <w:sz w:val="24"/>
-        </w:rPr>
-        <w:t xml:space="preserve">三、过程记录：按时间线记录主要操作步骤（安装、创建、修改、运行）。</w:t>
-      </w:r>
-    </w:p>
-    <w:p>
-      <w:pPr>
-        <w:pStyle w:val="BodyText"/>
-        <w:ind w:firstLineChars="200" w:firstLine="480"/>
-        <w:spacing w:beforeLines="50" w:afterLines="0" w:line="360" w:lineRule="auto" w:before="120" w:after="0"/>
-        <w:jc w:val="both"/>
-      </w:pPr>
-      <w:r>
-        <w:rPr>
-          <w:rFonts w:hint="eastAsia" w:ascii="Times New Roman" w:hAnsi="Times New Roman" w:eastAsia="宋体" w:cs="Times New Roman"/>
-          <w:i w:val="0"/>
-          <w:color w:val="000000"/>
-          <w:sz w:val="24"/>
-        </w:rPr>
-        <w:t xml:space="preserve">四、关键代码：粘贴1至3段关键代码并逐行解释（注明是否AI生成、如何验证）。</w:t>
-      </w:r>
-    </w:p>
-    <w:p>
-      <w:pPr>
-        <w:pStyle w:val="BodyText"/>
-        <w:ind w:firstLineChars="200" w:firstLine="480"/>
-        <w:spacing w:beforeLines="50" w:afterLines="0" w:line="360" w:lineRule="auto" w:before="120" w:after="0"/>
-        <w:jc w:val="both"/>
-      </w:pPr>
-      <w:r>
-        <w:rPr>
-          <w:rFonts w:hint="eastAsia" w:ascii="Times New Roman" w:hAnsi="Times New Roman" w:eastAsia="宋体" w:cs="Times New Roman"/>
-          <w:i w:val="0"/>
-          <w:color w:val="000000"/>
-          <w:sz w:val="24"/>
-        </w:rPr>
-        <w:t xml:space="preserve">五、检查点结果：正常与异常路径均正确输出。附证据说明。</w:t>
-      </w:r>
-    </w:p>
-    <w:p>
-      <w:pPr>
-        <w:pStyle w:val="BodyText"/>
-        <w:ind w:firstLineChars="200" w:firstLine="480"/>
-        <w:spacing w:beforeLines="50" w:afterLines="0" w:line="360" w:lineRule="auto" w:before="120" w:after="0"/>
-        <w:jc w:val="both"/>
-      </w:pPr>
-      <w:r>
-        <w:rPr>
-          <w:rFonts w:hint="eastAsia" w:ascii="Times New Roman" w:hAnsi="Times New Roman" w:eastAsia="宋体" w:cs="Times New Roman"/>
-          <w:i w:val="0"/>
-          <w:color w:val="000000"/>
-          <w:sz w:val="24"/>
-        </w:rPr>
-        <w:t xml:space="preserve">六、问题与调试：遇到的问题、定位过程、解决方案（至少1条真实记录）。</w:t>
-      </w:r>
-    </w:p>
-    <w:p>
-      <w:pPr>
-        <w:pStyle w:val="BodyText"/>
-        <w:ind w:firstLineChars="200" w:firstLine="480"/>
-        <w:spacing w:beforeLines="50" w:afterLines="0" w:line="360" w:lineRule="auto" w:before="120" w:after="0"/>
-        <w:jc w:val="both"/>
-      </w:pPr>
-      <w:r>
-        <w:rPr>
-          <w:rFonts w:hint="eastAsia" w:ascii="Times New Roman" w:hAnsi="Times New Roman" w:eastAsia="宋体" w:cs="Times New Roman"/>
-          <w:i w:val="0"/>
-          <w:color w:val="000000"/>
-          <w:sz w:val="24"/>
-        </w:rPr>
-        <w:t xml:space="preserve">七、AI使用记录：TraeCode使用清单（用途、指令摘要、输出、本人验证方式）。</w:t>
-      </w:r>
-    </w:p>
-    <w:p>
-      <w:pPr>
-        <w:pStyle w:val="BodyText"/>
-        <w:ind w:firstLineChars="200" w:firstLine="480"/>
-        <w:spacing w:beforeLines="50" w:afterLines="0" w:line="360" w:lineRule="auto" w:before="120" w:after="0"/>
-        <w:jc w:val="both"/>
-      </w:pPr>
-      <w:r>
-        <w:rPr>
-          <w:rFonts w:hint="eastAsia" w:ascii="Times New Roman" w:hAnsi="Times New Roman" w:eastAsia="宋体" w:cs="Times New Roman"/>
-          <w:i w:val="0"/>
-          <w:color w:val="000000"/>
-          <w:sz w:val="24"/>
-        </w:rPr>
-        <w:t xml:space="preserve">八、证据截图：运行截图、flutter</w:t>
-      </w:r>
-      <w:r>
-        <w:rPr>
-          <w:rFonts w:ascii="Times New Roman" w:hAnsi="Times New Roman" w:eastAsia="宋体" w:cs="Times New Roman"/>
-          <w:i w:val="0"/>
-          <w:color w:val="000000"/>
-          <w:sz w:val="24"/>
-        </w:rPr>
-        <w:t xml:space="preserve"> </w:t>
-      </w:r>
-      <w:r>
-        <w:rPr>
-          <w:rFonts w:hint="eastAsia" w:ascii="Times New Roman" w:hAnsi="Times New Roman" w:eastAsia="宋体" w:cs="Times New Roman"/>
-          <w:i w:val="0"/>
-          <w:color w:val="000000"/>
-          <w:sz w:val="24"/>
-        </w:rPr>
-        <w:t xml:space="preserve">doctor或控制台输出、Git提交记录（每图配一句话说明）。</w:t>
-      </w:r>
-    </w:p>
-    <w:p>
-      <w:pPr>
-        <w:pStyle w:val="BodyText"/>
-        <w:ind w:firstLineChars="200" w:firstLine="480"/>
-        <w:spacing w:beforeLines="50" w:afterLines="0" w:line="360" w:lineRule="auto" w:before="120" w:after="0"/>
-        <w:jc w:val="both"/>
-      </w:pPr>
-      <w:r>
-        <w:rPr>
-          <w:rFonts w:hint="eastAsia" w:ascii="Times New Roman" w:hAnsi="Times New Roman" w:eastAsia="宋体" w:cs="Times New Roman"/>
-          <w:i w:val="0"/>
-          <w:color w:val="000000"/>
-          <w:sz w:val="24"/>
-        </w:rPr>
-        <w:t xml:space="preserve">九、自评：对照本次作业要求逐项自查完成情况。</w:t>
-      </w:r>
-    </w:p>
-    <w:p>
-      <w:pPr>
-        <w:pStyle w:val="BodyText"/>
-        <w:ind w:firstLineChars="200" w:firstLine="480"/>
-        <w:spacing w:beforeLines="50" w:afterLines="0" w:line="360" w:lineRule="auto" w:before="120" w:after="0"/>
-        <w:jc w:val="both"/>
-      </w:pPr>
-      <w:r>
-        <w:rPr>
-          <w:rFonts w:hint="eastAsia" w:ascii="Times New Roman" w:hAnsi="Times New Roman" w:eastAsia="宋体" w:cs="Times New Roman"/>
-          <w:i w:val="0"/>
-          <w:color w:val="000000"/>
-          <w:sz w:val="24"/>
-        </w:rPr>
-        <w:t xml:space="preserve">十、一句话收获与下一步计划：本课一句话收获；遗留问题与下次课的预习要点。</w:t>
+        <w:t xml:space="preserve">一、任务理解</w:t>
+      </w:r>
+    </w:p>
+    <w:p>
+      <w:pPr>
+        <w:pStyle w:val="BodyText"/>
+        <w:ind w:firstLineChars="200" w:firstLine="480"/>
+        <w:spacing w:beforeLines="50" w:afterLines="0" w:line="360" w:lineRule="auto" w:before="120" w:after="0"/>
+        <w:jc w:val="both"/>
+      </w:pPr>
+      <w:r>
+        <w:rPr>
+          <w:rFonts w:hint="eastAsia" w:ascii="Times New Roman" w:hAnsi="Times New Roman" w:eastAsia="宋体" w:cs="Times New Roman"/>
+          <w:i w:val="0"/>
+          <w:color w:val="000000"/>
+          <w:sz w:val="24"/>
+        </w:rPr>
+        <w:t xml:space="preserve">本次作业是 Dart 语言基础的收官实践，围绕异步模型、异常处理、包管理与 JSON 编解码四个主题展开。核心任务是复现 async_json 命令行小工具：异步读取本地 data/books.json，解析为 Book 模型列表，输出图书总数、各类目数量统计、借阅量 Top3。</w:t>
+      </w:r>
+    </w:p>
+    <w:p>
+      <w:pPr>
+        <w:pStyle w:val="BodyText"/>
+        <w:ind w:firstLineChars="200" w:firstLine="480"/>
+        <w:spacing w:beforeLines="50" w:afterLines="0" w:line="360" w:lineRule="auto" w:before="120" w:after="0"/>
+        <w:jc w:val="both"/>
+      </w:pPr>
+      <w:r>
+        <w:rPr>
+          <w:rFonts w:hint="eastAsia" w:ascii="Times New Roman" w:hAnsi="Times New Roman" w:eastAsia="宋体" w:cs="Times New Roman"/>
+          <w:i w:val="0"/>
+          <w:color w:val="000000"/>
+          <w:sz w:val="24"/>
+        </w:rPr>
+        <w:t xml:space="preserve">验收标准：正常路径统计输出正确（总数、类目分布、借阅量 Top3）；异常路径（文件缺失、字段缺失、类型错误）均给出可读提示、不崩溃；模型类 fromJson/toJson 完整且 roundtrip 一致；依赖使用 ^ 约束，pubspec.lock 已提交；Git 3 次以上规范提交；报告按十节模板填写。</w:t>
+      </w:r>
+    </w:p>
+    <w:p>
+      <w:pPr>
+        <w:pStyle w:val="BodyText"/>
+        <w:ind w:firstLineChars="200" w:firstLine="480"/>
+        <w:spacing w:beforeLines="50" w:afterLines="0" w:line="360" w:lineRule="auto" w:before="120" w:after="0"/>
+        <w:jc w:val="both"/>
+      </w:pPr>
+      <w:r>
+        <w:rPr>
+          <w:rFonts w:hint="eastAsia" w:ascii="Times New Roman" w:hAnsi="Times New Roman" w:eastAsia="宋体" w:cs="Times New Roman"/>
+          <w:i w:val="0"/>
+          <w:color w:val="000000"/>
+          <w:sz w:val="24"/>
+        </w:rPr>
+        <w:t xml:space="preserve">二、环境与工具</w:t>
+      </w:r>
+    </w:p>
+    <w:p>
+      <w:pPr>
+        <w:pStyle w:val="BodyText"/>
+        <w:ind w:firstLineChars="200" w:firstLine="480"/>
+        <w:spacing w:beforeLines="50" w:afterLines="0" w:line="360" w:lineRule="auto" w:before="120" w:after="0"/>
+        <w:jc w:val="both"/>
+      </w:pPr>
+      <w:r>
+        <w:rPr>
+          <w:rFonts w:hint="eastAsia" w:ascii="Times New Roman" w:hAnsi="Times New Roman" w:eastAsia="宋体" w:cs="Times New Roman"/>
+          <w:i w:val="0"/>
+          <w:color w:val="000000"/>
+          <w:sz w:val="24"/>
+        </w:rPr>
+        <w:t xml:space="preserve">操作系统：Windows 11；Dart SDK：3.13.4（stable）；开发工具：Trae IDE；运行目标：命令行（Console）；AI 工具：Trae AI；包管理：Dart pub（path: ^1.9.1）。</w:t>
+      </w:r>
+    </w:p>
+    <w:p>
+      <w:pPr>
+        <w:pStyle w:val="BodyText"/>
+        <w:ind w:firstLineChars="200" w:firstLine="480"/>
+        <w:spacing w:beforeLines="50" w:afterLines="0" w:line="360" w:lineRule="auto" w:before="120" w:after="0"/>
+        <w:jc w:val="both"/>
+      </w:pPr>
+      <w:r>
+        <w:rPr>
+          <w:rFonts w:hint="eastAsia" w:ascii="Times New Roman" w:hAnsi="Times New Roman" w:eastAsia="宋体" w:cs="Times New Roman"/>
+          <w:i w:val="0"/>
+          <w:color w:val="000000"/>
+          <w:sz w:val="24"/>
+        </w:rPr>
+        <w:t xml:space="preserve">三、过程记录</w:t>
+      </w:r>
+    </w:p>
+    <w:p>
+      <w:pPr>
+        <w:pStyle w:val="BodyText"/>
+        <w:ind w:firstLineChars="200" w:firstLine="480"/>
+        <w:spacing w:beforeLines="50" w:afterLines="0" w:line="360" w:lineRule="auto" w:before="120" w:after="0"/>
+        <w:jc w:val="both"/>
+      </w:pPr>
+      <w:r>
+        <w:rPr>
+          <w:rFonts w:hint="eastAsia" w:ascii="Times New Roman" w:hAnsi="Times New Roman" w:eastAsia="宋体" w:cs="Times New Roman"/>
+          <w:i w:val="0"/>
+          <w:color w:val="000000"/>
+          <w:sz w:val="24"/>
+        </w:rPr>
+        <w:t xml:space="preserve">1. dart create async_json 创建命令行项目，自动生成 pubspec.yaml、bin/、lib/、test/ 等结构。</w:t>
+      </w:r>
+    </w:p>
+    <w:p>
+      <w:pPr>
+        <w:pStyle w:val="BodyText"/>
+        <w:ind w:firstLineChars="200" w:firstLine="480"/>
+        <w:spacing w:beforeLines="50" w:afterLines="0" w:line="360" w:lineRule="auto" w:before="120" w:after="0"/>
+        <w:jc w:val="both"/>
+      </w:pPr>
+      <w:r>
+        <w:rPr>
+          <w:rFonts w:hint="eastAsia" w:ascii="Times New Roman" w:hAnsi="Times New Roman" w:eastAsia="宋体" w:cs="Times New Roman"/>
+          <w:i w:val="0"/>
+          <w:color w:val="000000"/>
+          <w:sz w:val="24"/>
+        </w:rPr>
+        <w:t xml:space="preserve">2. dart pub add path 添加 path 依赖，确认 pubspec.yaml 使用 ^1.9.1 约束。</w:t>
+      </w:r>
+    </w:p>
+    <w:p>
+      <w:pPr>
+        <w:pStyle w:val="BodyText"/>
+        <w:ind w:firstLineChars="200" w:firstLine="480"/>
+        <w:spacing w:beforeLines="50" w:afterLines="0" w:line="360" w:lineRule="auto" w:before="120" w:after="0"/>
+        <w:jc w:val="both"/>
+      </w:pPr>
+      <w:r>
+        <w:rPr>
+          <w:rFonts w:hint="eastAsia" w:ascii="Times New Roman" w:hAnsi="Times New Roman" w:eastAsia="宋体" w:cs="Times New Roman"/>
+          <w:i w:val="0"/>
+          <w:color w:val="000000"/>
+          <w:sz w:val="24"/>
+        </w:rPr>
+        <w:t xml:space="preserve">3. 创建 data/books.json，写入 20 条图书记录（5 个类目，每类 4 本），字段为 id、title、category、borrowCount。</w:t>
+      </w:r>
+    </w:p>
+    <w:p>
+      <w:pPr>
+        <w:pStyle w:val="BodyText"/>
+        <w:ind w:firstLineChars="200" w:firstLine="480"/>
+        <w:spacing w:beforeLines="50" w:afterLines="0" w:line="360" w:lineRule="auto" w:before="120" w:after="0"/>
+        <w:jc w:val="both"/>
+      </w:pPr>
+      <w:r>
+        <w:rPr>
+          <w:rFonts w:hint="eastAsia" w:ascii="Times New Roman" w:hAnsi="Times New Roman" w:eastAsia="宋体" w:cs="Times New Roman"/>
+          <w:i w:val="0"/>
+          <w:color w:val="000000"/>
+          <w:sz w:val="24"/>
+        </w:rPr>
+        <w:t xml:space="preserve">4. 第一次提交：feat: dataset &amp; deps ready。</w:t>
+      </w:r>
+    </w:p>
+    <w:p>
+      <w:pPr>
+        <w:pStyle w:val="BodyText"/>
+        <w:ind w:firstLineChars="200" w:firstLine="480"/>
+        <w:spacing w:beforeLines="50" w:afterLines="0" w:line="360" w:lineRule="auto" w:before="120" w:after="0"/>
+        <w:jc w:val="both"/>
+      </w:pPr>
+      <w:r>
+        <w:rPr>
+          <w:rFonts w:hint="eastAsia" w:ascii="Times New Roman" w:hAnsi="Times New Roman" w:eastAsia="宋体" w:cs="Times New Roman"/>
+          <w:i w:val="0"/>
+          <w:color w:val="000000"/>
+          <w:sz w:val="24"/>
+        </w:rPr>
+        <w:t xml:space="preserve">5. 在 lib/async_json.dart 实现 Book 模型类，含 fromJson（as num → toInt()）与 toJson。</w:t>
+      </w:r>
+    </w:p>
+    <w:p>
+      <w:pPr>
+        <w:pStyle w:val="BodyText"/>
+        <w:ind w:firstLineChars="200" w:firstLine="480"/>
+        <w:spacing w:beforeLines="50" w:afterLines="0" w:line="360" w:lineRule="auto" w:before="120" w:after="0"/>
+        <w:jc w:val="both"/>
+      </w:pPr>
+      <w:r>
+        <w:rPr>
+          <w:rFonts w:hint="eastAsia" w:ascii="Times New Roman" w:hAnsi="Times New Roman" w:eastAsia="宋体" w:cs="Times New Roman"/>
+          <w:i w:val="0"/>
+          <w:color w:val="000000"/>
+          <w:sz w:val="24"/>
+        </w:rPr>
+        <w:t xml:space="preserve">6. 在 bin/async_json.dart 实现 main：await File.readAsString() → jsonDecode → List&lt;Book&gt; → 统计输出。运行验证正常路径。第二次提交：feat: parse &amp; stats from books.json。</w:t>
+      </w:r>
+    </w:p>
+    <w:p>
+      <w:pPr>
+        <w:pStyle w:val="BodyText"/>
+        <w:ind w:firstLineChars="200" w:firstLine="480"/>
+        <w:spacing w:beforeLines="50" w:afterLines="0" w:line="360" w:lineRule="auto" w:before="120" w:after="0"/>
+        <w:jc w:val="both"/>
+      </w:pPr>
+      <w:r>
+        <w:rPr>
+          <w:rFonts w:hint="eastAsia" w:ascii="Times New Roman" w:hAnsi="Times New Roman" w:eastAsia="宋体" w:cs="Times New Roman"/>
+          <w:i w:val="0"/>
+          <w:color w:val="000000"/>
+          <w:sz w:val="24"/>
+        </w:rPr>
+        <w:t xml:space="preserve">7. 增强鲁棒性：fromJson 字段缺失用默认值（borrowCount 默认 0）；main 增加文件存在性检查、FileSystemException/FormatException/TypeError 分层捕获。测试三条异常路径。第三次提交：feat: robust missing-field &amp; file handling。</w:t>
+      </w:r>
+    </w:p>
+    <w:p>
+      <w:pPr>
+        <w:pStyle w:val="BodyText"/>
+        <w:ind w:firstLineChars="200" w:firstLine="480"/>
+        <w:spacing w:beforeLines="50" w:afterLines="0" w:line="360" w:lineRule="auto" w:before="120" w:after="0"/>
+        <w:jc w:val="both"/>
+      </w:pPr>
+      <w:r>
+        <w:rPr>
+          <w:rFonts w:hint="eastAsia" w:ascii="Times New Roman" w:hAnsi="Times New Roman" w:eastAsia="宋体" w:cs="Times New Roman"/>
+          <w:i w:val="0"/>
+          <w:color w:val="000000"/>
+          <w:sz w:val="24"/>
+        </w:rPr>
+        <w:t xml:space="preserve">8. 补充异步计时实验（串行 await vs Future.wait）、嵌套回调改写、Stream 演示三个脚本并运行验证。第四次提交。</w:t>
+      </w:r>
+    </w:p>
+    <w:p>
+      <w:pPr>
+        <w:pStyle w:val="BodyText"/>
+        <w:ind w:firstLineChars="200" w:firstLine="480"/>
+        <w:spacing w:beforeLines="50" w:afterLines="0" w:line="360" w:lineRule="auto" w:before="120" w:after="0"/>
+        <w:jc w:val="both"/>
+      </w:pPr>
+      <w:r>
+        <w:rPr>
+          <w:rFonts w:hint="eastAsia" w:ascii="Times New Roman" w:hAnsi="Times New Roman" w:eastAsia="宋体" w:cs="Times New Roman"/>
+          <w:i w:val="0"/>
+          <w:color w:val="000000"/>
+          <w:sz w:val="24"/>
+        </w:rPr>
+        <w:t xml:space="preserve">9. 补充单元测试（fromJson、roundtrip、缺失字段、double 兼容），dart test 全部通过，dart analyze 无问题。</w:t>
+      </w:r>
+    </w:p>
+    <w:p>
+      <w:pPr>
+        <w:pStyle w:val="BodyText"/>
+        <w:ind w:firstLineChars="200" w:firstLine="480"/>
+        <w:spacing w:beforeLines="50" w:afterLines="0" w:line="360" w:lineRule="auto" w:before="120" w:after="0"/>
+        <w:jc w:val="both"/>
+      </w:pPr>
+      <w:r>
+        <w:rPr>
+          <w:rFonts w:hint="eastAsia" w:ascii="Times New Roman" w:hAnsi="Times New Roman" w:eastAsia="宋体" w:cs="Times New Roman"/>
+          <w:i w:val="0"/>
+          <w:color w:val="000000"/>
+          <w:sz w:val="24"/>
+        </w:rPr>
+        <w:t xml:space="preserve">四、关键代码</w:t>
+      </w:r>
+    </w:p>
+    <w:p>
+      <w:pPr>
+        <w:pStyle w:val="BodyText"/>
+        <w:ind w:firstLineChars="200" w:firstLine="480"/>
+        <w:spacing w:beforeLines="50" w:afterLines="0" w:line="360" w:lineRule="auto" w:before="120" w:after="0"/>
+        <w:jc w:val="both"/>
+      </w:pPr>
+      <w:r>
+        <w:rPr>
+          <w:rFonts w:hint="eastAsia" w:ascii="Times New Roman" w:hAnsi="Times New Roman" w:eastAsia="宋体" w:cs="Times New Roman"/>
+          <w:i w:val="0"/>
+          <w:color w:val="000000"/>
+          <w:sz w:val="24"/>
+        </w:rPr>
+        <w:t xml:space="preserve">代码段 1：Book.fromJson（鲁棒版）</w:t>
+      </w:r>
+    </w:p>
+    <w:p>
+      <w:pPr>
+        <w:pStyle w:val="BodyText"/>
+        <w:spacing w:beforeLines="0" w:afterLines="0" w:line="276" w:lineRule="auto" w:before="0" w:after="0"/>
+        <w:jc w:val="left"/>
+      </w:pPr>
+      <w:r>
+        <w:rPr>
+          <w:rFonts w:ascii="Consolas" w:hAnsi="Consolas" w:eastAsia="Consolas" w:cs="Consolas"/>
+          <w:color w:val="000000"/>
+          <w:sz w:val="20"/>
+        </w:rPr>
+        <w:t xml:space="preserve">factory Book.fromJson(Map&lt;String, dynamic&gt; j) {</w:t>
+      </w:r>
+    </w:p>
+    <w:p>
+      <w:pPr>
+        <w:pStyle w:val="BodyText"/>
+        <w:spacing w:beforeLines="0" w:afterLines="0" w:line="276" w:lineRule="auto" w:before="0" w:after="0"/>
+        <w:jc w:val="left"/>
+      </w:pPr>
+      <w:r>
+        <w:rPr>
+          <w:rFonts w:ascii="Consolas" w:hAnsi="Consolas" w:eastAsia="Consolas" w:cs="Consolas"/>
+          <w:color w:val="000000"/>
+          <w:sz w:val="20"/>
+        </w:rPr>
+        <w:t xml:space="preserve">  return Book(</w:t>
+      </w:r>
+    </w:p>
+    <w:p>
+      <w:pPr>
+        <w:pStyle w:val="BodyText"/>
+        <w:spacing w:beforeLines="0" w:afterLines="0" w:line="276" w:lineRule="auto" w:before="0" w:after="0"/>
+        <w:jc w:val="left"/>
+      </w:pPr>
+      <w:r>
+        <w:rPr>
+          <w:rFonts w:ascii="Consolas" w:hAnsi="Consolas" w:eastAsia="Consolas" w:cs="Consolas"/>
+          <w:color w:val="000000"/>
+          <w:sz w:val="20"/>
+        </w:rPr>
+        <w:t xml:space="preserve">    id: (j['id'] as String?) ?? '未知ID',</w:t>
+      </w:r>
+    </w:p>
+    <w:p>
+      <w:pPr>
+        <w:pStyle w:val="BodyText"/>
+        <w:spacing w:beforeLines="0" w:afterLines="0" w:line="276" w:lineRule="auto" w:before="0" w:after="0"/>
+        <w:jc w:val="left"/>
+      </w:pPr>
+      <w:r>
+        <w:rPr>
+          <w:rFonts w:ascii="Consolas" w:hAnsi="Consolas" w:eastAsia="Consolas" w:cs="Consolas"/>
+          <w:color w:val="000000"/>
+          <w:sz w:val="20"/>
+        </w:rPr>
+        <w:t xml:space="preserve">    title: (j['title'] as String?) ?? '未知标题',</w:t>
+      </w:r>
+    </w:p>
+    <w:p>
+      <w:pPr>
+        <w:pStyle w:val="BodyText"/>
+        <w:spacing w:beforeLines="0" w:afterLines="0" w:line="276" w:lineRule="auto" w:before="0" w:after="0"/>
+        <w:jc w:val="left"/>
+      </w:pPr>
+      <w:r>
+        <w:rPr>
+          <w:rFonts w:ascii="Consolas" w:hAnsi="Consolas" w:eastAsia="Consolas" w:cs="Consolas"/>
+          <w:color w:val="000000"/>
+          <w:sz w:val="20"/>
+        </w:rPr>
+        <w:t xml:space="preserve">    category: (j['category'] as String?) ?? '未分类',</w:t>
+      </w:r>
+    </w:p>
+    <w:p>
+      <w:pPr>
+        <w:pStyle w:val="BodyText"/>
+        <w:spacing w:beforeLines="0" w:afterLines="0" w:line="276" w:lineRule="auto" w:before="0" w:after="0"/>
+        <w:jc w:val="left"/>
+      </w:pPr>
+      <w:r>
+        <w:rPr>
+          <w:rFonts w:ascii="Consolas" w:hAnsi="Consolas" w:eastAsia="Consolas" w:cs="Consolas"/>
+          <w:color w:val="000000"/>
+          <w:sz w:val="20"/>
+        </w:rPr>
+        <w:t xml:space="preserve">    borrowCount: (j['borrowCount'] as num?)?.toInt() ?? 0,</w:t>
+      </w:r>
+    </w:p>
+    <w:p>
+      <w:pPr>
+        <w:pStyle w:val="BodyText"/>
+        <w:spacing w:beforeLines="0" w:afterLines="0" w:line="276" w:lineRule="auto" w:before="0" w:after="0"/>
+        <w:jc w:val="left"/>
+      </w:pPr>
+      <w:r>
+        <w:rPr>
+          <w:rFonts w:ascii="Consolas" w:hAnsi="Consolas" w:eastAsia="Consolas" w:cs="Consolas"/>
+          <w:color w:val="000000"/>
+          <w:sz w:val="20"/>
+        </w:rPr>
+        <w:t xml:space="preserve">  );</w:t>
+      </w:r>
+    </w:p>
+    <w:p>
+      <w:pPr>
+        <w:pStyle w:val="BodyText"/>
+        <w:spacing w:beforeLines="0" w:afterLines="0" w:line="276" w:lineRule="auto" w:before="0" w:after="0"/>
+        <w:jc w:val="left"/>
+      </w:pPr>
+      <w:r>
+        <w:rPr>
+          <w:rFonts w:ascii="Consolas" w:hAnsi="Consolas" w:eastAsia="Consolas" w:cs="Consolas"/>
+          <w:color w:val="000000"/>
+          <w:sz w:val="20"/>
+        </w:rPr>
+        <w:t xml:space="preserve">}</w:t>
+      </w:r>
+    </w:p>
+    <w:p>
+      <w:pPr>
+        <w:pStyle w:val="BodyText"/>
+        <w:ind w:firstLineChars="200" w:firstLine="480"/>
+        <w:spacing w:beforeLines="50" w:afterLines="0" w:line="360" w:lineRule="auto" w:before="120" w:after="0"/>
+        <w:jc w:val="both"/>
+      </w:pPr>
+      <w:r>
+        <w:rPr>
+          <w:rFonts w:hint="eastAsia" w:ascii="Times New Roman" w:hAnsi="Times New Roman" w:eastAsia="宋体" w:cs="Times New Roman"/>
+          <w:i w:val="0"/>
+          <w:color w:val="000000"/>
+          <w:sz w:val="24"/>
+        </w:rPr>
+        <w:t xml:space="preserve">逐行解释：as String? 允许字段为 null，缺失时不抛 TypeError；?? 回退到默认占位文本；(j['borrowCount'] as num?)?.toInt() ?? 0 用 num 兼容 int/double，?. 防 null 调用，缺失时默认 0。验证方式：单元测试覆盖完整字段、缺失字段、double 输入三种情况，均通过。</w:t>
+      </w:r>
+    </w:p>
+    <w:p>
+      <w:pPr>
+        <w:pStyle w:val="BodyText"/>
+        <w:ind w:firstLineChars="200" w:firstLine="480"/>
+        <w:spacing w:beforeLines="50" w:afterLines="0" w:line="360" w:lineRule="auto" w:before="120" w:after="0"/>
+        <w:jc w:val="both"/>
+      </w:pPr>
+      <w:r>
+        <w:rPr>
+          <w:rFonts w:hint="eastAsia" w:ascii="Times New Roman" w:hAnsi="Times New Roman" w:eastAsia="宋体" w:cs="Times New Roman"/>
+          <w:i w:val="0"/>
+          <w:color w:val="000000"/>
+          <w:sz w:val="24"/>
+        </w:rPr>
+        <w:t xml:space="preserve">代码段 2：异步读取与解析（含异常分层捕获）</w:t>
+      </w:r>
+    </w:p>
+    <w:p>
+      <w:pPr>
+        <w:pStyle w:val="BodyText"/>
+        <w:spacing w:beforeLines="0" w:afterLines="0" w:line="276" w:lineRule="auto" w:before="0" w:after="0"/>
+        <w:jc w:val="left"/>
+      </w:pPr>
+      <w:r>
+        <w:rPr>
+          <w:rFonts w:ascii="Consolas" w:hAnsi="Consolas" w:eastAsia="Consolas" w:cs="Consolas"/>
+          <w:color w:val="000000"/>
+          <w:sz w:val="20"/>
+        </w:rPr>
+        <w:t xml:space="preserve">final file = File(dataPath);</w:t>
+      </w:r>
+    </w:p>
+    <w:p>
+      <w:pPr>
+        <w:pStyle w:val="BodyText"/>
+        <w:spacing w:beforeLines="0" w:afterLines="0" w:line="276" w:lineRule="auto" w:before="0" w:after="0"/>
+        <w:jc w:val="left"/>
+      </w:pPr>
+      <w:r>
+        <w:rPr>
+          <w:rFonts w:ascii="Consolas" w:hAnsi="Consolas" w:eastAsia="Consolas" w:cs="Consolas"/>
+          <w:color w:val="000000"/>
+          <w:sz w:val="20"/>
+        </w:rPr>
+        <w:t xml:space="preserve">if (!await file.exists()) {</w:t>
+      </w:r>
+    </w:p>
+    <w:p>
+      <w:pPr>
+        <w:pStyle w:val="BodyText"/>
+        <w:spacing w:beforeLines="0" w:afterLines="0" w:line="276" w:lineRule="auto" w:before="0" w:after="0"/>
+        <w:jc w:val="left"/>
+      </w:pPr>
+      <w:r>
+        <w:rPr>
+          <w:rFonts w:ascii="Consolas" w:hAnsi="Consolas" w:eastAsia="Consolas" w:cs="Consolas"/>
+          <w:color w:val="000000"/>
+          <w:sz w:val="20"/>
+        </w:rPr>
+        <w:t xml:space="preserve">  print('数据文件缺失，请检查 data/books.json');</w:t>
+      </w:r>
+    </w:p>
+    <w:p>
+      <w:pPr>
+        <w:pStyle w:val="BodyText"/>
+        <w:spacing w:beforeLines="0" w:afterLines="0" w:line="276" w:lineRule="auto" w:before="0" w:after="0"/>
+        <w:jc w:val="left"/>
+      </w:pPr>
+      <w:r>
+        <w:rPr>
+          <w:rFonts w:ascii="Consolas" w:hAnsi="Consolas" w:eastAsia="Consolas" w:cs="Consolas"/>
+          <w:color w:val="000000"/>
+          <w:sz w:val="20"/>
+        </w:rPr>
+        <w:t xml:space="preserve">  return;</w:t>
+      </w:r>
+    </w:p>
+    <w:p>
+      <w:pPr>
+        <w:pStyle w:val="BodyText"/>
+        <w:spacing w:beforeLines="0" w:afterLines="0" w:line="276" w:lineRule="auto" w:before="0" w:after="0"/>
+        <w:jc w:val="left"/>
+      </w:pPr>
+      <w:r>
+        <w:rPr>
+          <w:rFonts w:ascii="Consolas" w:hAnsi="Consolas" w:eastAsia="Consolas" w:cs="Consolas"/>
+          <w:color w:val="000000"/>
+          <w:sz w:val="20"/>
+        </w:rPr>
+        <w:t xml:space="preserve">}</w:t>
+      </w:r>
+    </w:p>
+    <w:p>
+      <w:pPr>
+        <w:pStyle w:val="BodyText"/>
+        <w:spacing w:beforeLines="0" w:afterLines="0" w:line="276" w:lineRule="auto" w:before="0" w:after="0"/>
+        <w:jc w:val="left"/>
+      </w:pPr>
+      <w:r>
+        <w:rPr>
+          <w:rFonts w:ascii="Consolas" w:hAnsi="Consolas" w:eastAsia="Consolas" w:cs="Consolas"/>
+          <w:color w:val="000000"/>
+          <w:sz w:val="20"/>
+        </w:rPr>
+        <w:t xml:space="preserve">final content = await file.readAsString();</w:t>
+      </w:r>
+    </w:p>
+    <w:p>
+      <w:pPr>
+        <w:pStyle w:val="BodyText"/>
+        <w:spacing w:beforeLines="0" w:afterLines="0" w:line="276" w:lineRule="auto" w:before="0" w:after="0"/>
+        <w:jc w:val="left"/>
+      </w:pPr>
+      <w:r>
+        <w:rPr>
+          <w:rFonts w:ascii="Consolas" w:hAnsi="Consolas" w:eastAsia="Consolas" w:cs="Consolas"/>
+          <w:color w:val="000000"/>
+          <w:sz w:val="20"/>
+        </w:rPr>
+        <w:t xml:space="preserve">final List&lt;dynamic&gt; jsonList = jsonDecode(content) as List&lt;dynamic&gt;;</w:t>
+      </w:r>
+    </w:p>
+    <w:p>
+      <w:pPr>
+        <w:pStyle w:val="BodyText"/>
+        <w:spacing w:beforeLines="0" w:afterLines="0" w:line="276" w:lineRule="auto" w:before="0" w:after="0"/>
+        <w:jc w:val="left"/>
+      </w:pPr>
+      <w:r>
+        <w:rPr>
+          <w:rFonts w:ascii="Consolas" w:hAnsi="Consolas" w:eastAsia="Consolas" w:cs="Consolas"/>
+          <w:color w:val="000000"/>
+          <w:sz w:val="20"/>
+        </w:rPr>
+        <w:t xml:space="preserve">final books = jsonList.map((e) =&gt; Book.fromJson(e as Map&lt;String, dynamic&gt;)).toList();</w:t>
+      </w:r>
+    </w:p>
+    <w:p>
+      <w:pPr>
+        <w:pStyle w:val="BodyText"/>
+        <w:ind w:firstLineChars="200" w:firstLine="480"/>
+        <w:spacing w:beforeLines="50" w:afterLines="0" w:line="360" w:lineRule="auto" w:before="120" w:after="0"/>
+        <w:jc w:val="both"/>
+      </w:pPr>
+      <w:r>
+        <w:rPr>
+          <w:rFonts w:hint="eastAsia" w:ascii="Times New Roman" w:hAnsi="Times New Roman" w:eastAsia="宋体" w:cs="Times New Roman"/>
+          <w:i w:val="0"/>
+          <w:color w:val="000000"/>
+          <w:sz w:val="24"/>
+        </w:rPr>
+        <w:t xml:space="preserve">逐行解释：await file.exists() 异步检查文件是否存在，不存在直接友好返回；await file.readAsString() 异步读取文件，不阻塞事件循环；jsonDecode 将 JSON 字符串转为 List；Book.fromJson 逐条解析为模型对象。验证：正常路径输出正确统计；改名 books.json 后运行输出"数据文件缺失"提示。</w:t>
+      </w:r>
+    </w:p>
+    <w:p>
+      <w:pPr>
+        <w:pStyle w:val="BodyText"/>
+        <w:ind w:firstLineChars="200" w:firstLine="480"/>
+        <w:spacing w:beforeLines="50" w:afterLines="0" w:line="360" w:lineRule="auto" w:before="120" w:after="0"/>
+        <w:jc w:val="both"/>
+      </w:pPr>
+      <w:r>
+        <w:rPr>
+          <w:rFonts w:hint="eastAsia" w:ascii="Times New Roman" w:hAnsi="Times New Roman" w:eastAsia="宋体" w:cs="Times New Roman"/>
+          <w:i w:val="0"/>
+          <w:color w:val="000000"/>
+          <w:sz w:val="24"/>
+        </w:rPr>
+        <w:t xml:space="preserve">代码段 3：统计输出</w:t>
+      </w:r>
+    </w:p>
+    <w:p>
+      <w:pPr>
+        <w:pStyle w:val="BodyText"/>
+        <w:spacing w:beforeLines="0" w:afterLines="0" w:line="276" w:lineRule="auto" w:before="0" w:after="0"/>
+        <w:jc w:val="left"/>
+      </w:pPr>
+      <w:r>
+        <w:rPr>
+          <w:rFonts w:ascii="Consolas" w:hAnsi="Consolas" w:eastAsia="Consolas" w:cs="Consolas"/>
+          <w:color w:val="000000"/>
+          <w:sz w:val="20"/>
+        </w:rPr>
+        <w:t xml:space="preserve">final categoryCounts = &lt;String, int&gt;{};</w:t>
+      </w:r>
+    </w:p>
+    <w:p>
+      <w:pPr>
+        <w:pStyle w:val="BodyText"/>
+        <w:spacing w:beforeLines="0" w:afterLines="0" w:line="276" w:lineRule="auto" w:before="0" w:after="0"/>
+        <w:jc w:val="left"/>
+      </w:pPr>
+      <w:r>
+        <w:rPr>
+          <w:rFonts w:ascii="Consolas" w:hAnsi="Consolas" w:eastAsia="Consolas" w:cs="Consolas"/>
+          <w:color w:val="000000"/>
+          <w:sz w:val="20"/>
+        </w:rPr>
+        <w:t xml:space="preserve">for (final b in books) {</w:t>
+      </w:r>
+    </w:p>
+    <w:p>
+      <w:pPr>
+        <w:pStyle w:val="BodyText"/>
+        <w:spacing w:beforeLines="0" w:afterLines="0" w:line="276" w:lineRule="auto" w:before="0" w:after="0"/>
+        <w:jc w:val="left"/>
+      </w:pPr>
+      <w:r>
+        <w:rPr>
+          <w:rFonts w:ascii="Consolas" w:hAnsi="Consolas" w:eastAsia="Consolas" w:cs="Consolas"/>
+          <w:color w:val="000000"/>
+          <w:sz w:val="20"/>
+        </w:rPr>
+        <w:t xml:space="preserve">  categoryCounts[b.category] = (categoryCounts[b.category] ?? 0) + 1;</w:t>
+      </w:r>
+    </w:p>
+    <w:p>
+      <w:pPr>
+        <w:pStyle w:val="BodyText"/>
+        <w:spacing w:beforeLines="0" w:afterLines="0" w:line="276" w:lineRule="auto" w:before="0" w:after="0"/>
+        <w:jc w:val="left"/>
+      </w:pPr>
+      <w:r>
+        <w:rPr>
+          <w:rFonts w:ascii="Consolas" w:hAnsi="Consolas" w:eastAsia="Consolas" w:cs="Consolas"/>
+          <w:color w:val="000000"/>
+          <w:sz w:val="20"/>
+        </w:rPr>
+        <w:t xml:space="preserve">}</w:t>
+      </w:r>
+    </w:p>
+    <w:p>
+      <w:pPr>
+        <w:pStyle w:val="BodyText"/>
+        <w:spacing w:beforeLines="0" w:afterLines="0" w:line="276" w:lineRule="auto" w:before="0" w:after="0"/>
+        <w:jc w:val="left"/>
+      </w:pPr>
+      <w:r>
+        <w:rPr>
+          <w:rFonts w:ascii="Consolas" w:hAnsi="Consolas" w:eastAsia="Consolas" w:cs="Consolas"/>
+          <w:color w:val="000000"/>
+          <w:sz w:val="20"/>
+        </w:rPr>
+        <w:t xml:space="preserve">final sorted = [...books]..sort((a, b) =&gt; b.borrowCount.compareTo(a.borrowCount));</w:t>
+      </w:r>
+    </w:p>
+    <w:p>
+      <w:pPr>
+        <w:pStyle w:val="BodyText"/>
+        <w:spacing w:beforeLines="0" w:afterLines="0" w:line="276" w:lineRule="auto" w:before="0" w:after="0"/>
+        <w:jc w:val="left"/>
+      </w:pPr>
+      <w:r>
+        <w:rPr>
+          <w:rFonts w:ascii="Consolas" w:hAnsi="Consolas" w:eastAsia="Consolas" w:cs="Consolas"/>
+          <w:color w:val="000000"/>
+          <w:sz w:val="20"/>
+        </w:rPr>
+        <w:t xml:space="preserve">for (final b in sorted.take(3)) {</w:t>
+      </w:r>
+    </w:p>
+    <w:p>
+      <w:pPr>
+        <w:pStyle w:val="BodyText"/>
+        <w:spacing w:beforeLines="0" w:afterLines="0" w:line="276" w:lineRule="auto" w:before="0" w:after="0"/>
+        <w:jc w:val="left"/>
+      </w:pPr>
+      <w:r>
+        <w:rPr>
+          <w:rFonts w:ascii="Consolas" w:hAnsi="Consolas" w:eastAsia="Consolas" w:cs="Consolas"/>
+          <w:color w:val="000000"/>
+          <w:sz w:val="20"/>
+        </w:rPr>
+        <w:t xml:space="preserve">  print('  ${b.title}（${b.borrowCount} 次借阅）');</w:t>
+      </w:r>
+    </w:p>
+    <w:p>
+      <w:pPr>
+        <w:pStyle w:val="BodyText"/>
+        <w:spacing w:beforeLines="0" w:afterLines="0" w:line="276" w:lineRule="auto" w:before="0" w:after="0"/>
+        <w:jc w:val="left"/>
+      </w:pPr>
+      <w:r>
+        <w:rPr>
+          <w:rFonts w:ascii="Consolas" w:hAnsi="Consolas" w:eastAsia="Consolas" w:cs="Consolas"/>
+          <w:color w:val="000000"/>
+          <w:sz w:val="20"/>
+        </w:rPr>
+        <w:t xml:space="preserve">}</w:t>
+      </w:r>
+    </w:p>
+    <w:p>
+      <w:pPr>
+        <w:pStyle w:val="BodyText"/>
+        <w:ind w:firstLineChars="200" w:firstLine="480"/>
+        <w:spacing w:beforeLines="50" w:afterLines="0" w:line="360" w:lineRule="auto" w:before="120" w:after="0"/>
+        <w:jc w:val="both"/>
+      </w:pPr>
+      <w:r>
+        <w:rPr>
+          <w:rFonts w:hint="eastAsia" w:ascii="Times New Roman" w:hAnsi="Times New Roman" w:eastAsia="宋体" w:cs="Times New Roman"/>
+          <w:i w:val="0"/>
+          <w:color w:val="000000"/>
+          <w:sz w:val="24"/>
+        </w:rPr>
+        <w:t xml:space="preserve">逐行解释：categoryCounts Map 统计每个类目的图书数量，?? 0 处理首次出现的类目；[...books] 创建副本再排序避免修改原列表；sort 按 borrowCount 降序，take(3) 取前三名。验证：20 本书 5 个类目各 4 本，Top3 为机器学习(245)、深度学习(220)、深入理解计算机系统(210)，与数据一致。</w:t>
+      </w:r>
+    </w:p>
+    <w:p>
+      <w:pPr>
+        <w:pStyle w:val="BodyText"/>
+        <w:ind w:firstLineChars="200" w:firstLine="480"/>
+        <w:spacing w:beforeLines="50" w:afterLines="0" w:line="360" w:lineRule="auto" w:before="120" w:after="0"/>
+        <w:jc w:val="both"/>
+      </w:pPr>
+      <w:r>
+        <w:rPr>
+          <w:rFonts w:hint="eastAsia" w:ascii="Times New Roman" w:hAnsi="Times New Roman" w:eastAsia="宋体" w:cs="Times New Roman"/>
+          <w:i w:val="0"/>
+          <w:color w:val="000000"/>
+          <w:sz w:val="24"/>
+        </w:rPr>
+        <w:t xml:space="preserve">五、检查点结果</w:t>
+      </w:r>
+    </w:p>
+    <w:p>
+      <w:pPr>
+        <w:pStyle w:val="BodyText"/>
+        <w:ind w:firstLineChars="200" w:firstLine="480"/>
+        <w:spacing w:beforeLines="50" w:afterLines="0" w:line="360" w:lineRule="auto" w:before="120" w:after="0"/>
+        <w:jc w:val="both"/>
+      </w:pPr>
+      <w:r>
+        <w:rPr>
+          <w:rFonts w:hint="eastAsia" w:ascii="Times New Roman" w:hAnsi="Times New Roman" w:eastAsia="宋体" w:cs="Times New Roman"/>
+          <w:i w:val="0"/>
+          <w:color w:val="000000"/>
+          <w:sz w:val="24"/>
+        </w:rPr>
+        <w:t xml:space="preserve">正常路径（运行 dart run）输出：</w:t>
+      </w:r>
+    </w:p>
+    <w:p>
+      <w:pPr>
+        <w:pStyle w:val="BodyText"/>
+        <w:spacing w:beforeLines="0" w:afterLines="0" w:line="276" w:lineRule="auto" w:before="0" w:after="0"/>
+        <w:jc w:val="left"/>
+      </w:pPr>
+      <w:r>
+        <w:rPr>
+          <w:rFonts w:ascii="Consolas" w:hAnsi="Consolas" w:eastAsia="Consolas" w:cs="Consolas"/>
+          <w:color w:val="000000"/>
+          <w:sz w:val="20"/>
+        </w:rPr>
+        <w:t xml:space="preserve">图书总数: 20</w:t>
+      </w:r>
+    </w:p>
+    <w:p>
+      <w:pPr>
+        <w:pStyle w:val="BodyText"/>
+        <w:spacing w:beforeLines="0" w:afterLines="0" w:line="276" w:lineRule="auto" w:before="0" w:after="0"/>
+        <w:jc w:val="left"/>
+      </w:pPr>
+      <w:r>
+        <w:rPr>
+          <w:rFonts w:ascii="Consolas" w:hAnsi="Consolas" w:eastAsia="Consolas" w:cs="Consolas"/>
+          <w:color w:val="000000"/>
+          <w:sz w:val="20"/>
+        </w:rPr>
+        <w:t xml:space="preserve">各类目数量:</w:t>
+      </w:r>
+    </w:p>
+    <w:p>
+      <w:pPr>
+        <w:pStyle w:val="BodyText"/>
+        <w:spacing w:beforeLines="0" w:afterLines="0" w:line="276" w:lineRule="auto" w:before="0" w:after="0"/>
+        <w:jc w:val="left"/>
+      </w:pPr>
+      <w:r>
+        <w:rPr>
+          <w:rFonts w:ascii="Consolas" w:hAnsi="Consolas" w:eastAsia="Consolas" w:cs="Consolas"/>
+          <w:color w:val="000000"/>
+          <w:sz w:val="20"/>
+        </w:rPr>
+        <w:t xml:space="preserve">  移动开发: 4</w:t>
+      </w:r>
+    </w:p>
+    <w:p>
+      <w:pPr>
+        <w:pStyle w:val="BodyText"/>
+        <w:spacing w:beforeLines="0" w:afterLines="0" w:line="276" w:lineRule="auto" w:before="0" w:after="0"/>
+        <w:jc w:val="left"/>
+      </w:pPr>
+      <w:r>
+        <w:rPr>
+          <w:rFonts w:ascii="Consolas" w:hAnsi="Consolas" w:eastAsia="Consolas" w:cs="Consolas"/>
+          <w:color w:val="000000"/>
+          <w:sz w:val="20"/>
+        </w:rPr>
+        <w:t xml:space="preserve">  计算机基础: 4</w:t>
+      </w:r>
+    </w:p>
+    <w:p>
+      <w:pPr>
+        <w:pStyle w:val="BodyText"/>
+        <w:spacing w:beforeLines="0" w:afterLines="0" w:line="276" w:lineRule="auto" w:before="0" w:after="0"/>
+        <w:jc w:val="left"/>
+      </w:pPr>
+      <w:r>
+        <w:rPr>
+          <w:rFonts w:ascii="Consolas" w:hAnsi="Consolas" w:eastAsia="Consolas" w:cs="Consolas"/>
+          <w:color w:val="000000"/>
+          <w:sz w:val="20"/>
+        </w:rPr>
+        <w:t xml:space="preserve">  软件工程: 4</w:t>
+      </w:r>
+    </w:p>
+    <w:p>
+      <w:pPr>
+        <w:pStyle w:val="BodyText"/>
+        <w:spacing w:beforeLines="0" w:afterLines="0" w:line="276" w:lineRule="auto" w:before="0" w:after="0"/>
+        <w:jc w:val="left"/>
+      </w:pPr>
+      <w:r>
+        <w:rPr>
+          <w:rFonts w:ascii="Consolas" w:hAnsi="Consolas" w:eastAsia="Consolas" w:cs="Consolas"/>
+          <w:color w:val="000000"/>
+          <w:sz w:val="20"/>
+        </w:rPr>
+        <w:t xml:space="preserve">  人工智能: 4</w:t>
+      </w:r>
+    </w:p>
+    <w:p>
+      <w:pPr>
+        <w:pStyle w:val="BodyText"/>
+        <w:spacing w:beforeLines="0" w:afterLines="0" w:line="276" w:lineRule="auto" w:before="0" w:after="0"/>
+        <w:jc w:val="left"/>
+      </w:pPr>
+      <w:r>
+        <w:rPr>
+          <w:rFonts w:ascii="Consolas" w:hAnsi="Consolas" w:eastAsia="Consolas" w:cs="Consolas"/>
+          <w:color w:val="000000"/>
+          <w:sz w:val="20"/>
+        </w:rPr>
+        <w:t xml:space="preserve">  数据库: 4</w:t>
+      </w:r>
+    </w:p>
+    <w:p>
+      <w:pPr>
+        <w:pStyle w:val="BodyText"/>
+        <w:spacing w:beforeLines="0" w:afterLines="0" w:line="276" w:lineRule="auto" w:before="0" w:after="0"/>
+        <w:jc w:val="left"/>
+      </w:pPr>
+      <w:r>
+        <w:rPr>
+          <w:rFonts w:ascii="Consolas" w:hAnsi="Consolas" w:eastAsia="Consolas" w:cs="Consolas"/>
+          <w:color w:val="000000"/>
+          <w:sz w:val="20"/>
+        </w:rPr>
+        <w:t xml:space="preserve">借阅量 Top3:</w:t>
+      </w:r>
+    </w:p>
+    <w:p>
+      <w:pPr>
+        <w:pStyle w:val="BodyText"/>
+        <w:spacing w:beforeLines="0" w:afterLines="0" w:line="276" w:lineRule="auto" w:before="0" w:after="0"/>
+        <w:jc w:val="left"/>
+      </w:pPr>
+      <w:r>
+        <w:rPr>
+          <w:rFonts w:ascii="Consolas" w:hAnsi="Consolas" w:eastAsia="Consolas" w:cs="Consolas"/>
+          <w:color w:val="000000"/>
+          <w:sz w:val="20"/>
+        </w:rPr>
+        <w:t xml:space="preserve">  机器学习（245 次借阅）</w:t>
+      </w:r>
+    </w:p>
+    <w:p>
+      <w:pPr>
+        <w:pStyle w:val="BodyText"/>
+        <w:spacing w:beforeLines="0" w:afterLines="0" w:line="276" w:lineRule="auto" w:before="0" w:after="0"/>
+        <w:jc w:val="left"/>
+      </w:pPr>
+      <w:r>
+        <w:rPr>
+          <w:rFonts w:ascii="Consolas" w:hAnsi="Consolas" w:eastAsia="Consolas" w:cs="Consolas"/>
+          <w:color w:val="000000"/>
+          <w:sz w:val="20"/>
+        </w:rPr>
+        <w:t xml:space="preserve">  深度学习（220 次借阅）</w:t>
+      </w:r>
+    </w:p>
+    <w:p>
+      <w:pPr>
+        <w:pStyle w:val="BodyText"/>
+        <w:spacing w:beforeLines="0" w:afterLines="0" w:line="276" w:lineRule="auto" w:before="0" w:after="0"/>
+        <w:jc w:val="left"/>
+      </w:pPr>
+      <w:r>
+        <w:rPr>
+          <w:rFonts w:ascii="Consolas" w:hAnsi="Consolas" w:eastAsia="Consolas" w:cs="Consolas"/>
+          <w:color w:val="000000"/>
+          <w:sz w:val="20"/>
+        </w:rPr>
+        <w:t xml:space="preserve">  深入理解计算机系统（210 次借阅）</w:t>
+      </w:r>
+    </w:p>
+    <w:p>
+      <w:pPr>
+        <w:pStyle w:val="BodyText"/>
+        <w:ind w:firstLineChars="200" w:firstLine="480"/>
+        <w:spacing w:beforeLines="50" w:afterLines="0" w:line="360" w:lineRule="auto" w:before="120" w:after="0"/>
+        <w:jc w:val="both"/>
+      </w:pPr>
+      <w:r>
+        <w:rPr>
+          <w:rFonts w:hint="eastAsia" w:ascii="Times New Roman" w:hAnsi="Times New Roman" w:eastAsia="宋体" w:cs="Times New Roman"/>
+          <w:i w:val="0"/>
+          <w:color w:val="000000"/>
+          <w:sz w:val="24"/>
+        </w:rPr>
+        <w:t xml:space="preserve">统计与 books.json 数据完全一致。</w:t>
+      </w:r>
+    </w:p>
+    <w:p>
+      <w:pPr>
+        <w:pStyle w:val="BodyText"/>
+        <w:ind w:firstLineChars="200" w:firstLine="480"/>
+        <w:spacing w:beforeLines="50" w:afterLines="0" w:line="360" w:lineRule="auto" w:before="120" w:after="0"/>
+        <w:jc w:val="both"/>
+      </w:pPr>
+      <w:r>
+        <w:rPr>
+          <w:rFonts w:hint="eastAsia" w:ascii="Times New Roman" w:hAnsi="Times New Roman" w:eastAsia="宋体" w:cs="Times New Roman"/>
+          <w:i w:val="0"/>
+          <w:color w:val="000000"/>
+          <w:sz w:val="24"/>
+        </w:rPr>
+        <w:t xml:space="preserve">异常路径：</w:t>
+      </w:r>
+    </w:p>
+    <w:p>
+      <w:pPr>
+        <w:pStyle w:val="BodyText"/>
+        <w:ind w:firstLineChars="200" w:firstLine="480"/>
+        <w:spacing w:beforeLines="50" w:afterLines="0" w:line="360" w:lineRule="auto" w:before="120" w:after="0"/>
+        <w:jc w:val="both"/>
+      </w:pPr>
+      <w:r>
+        <w:rPr>
+          <w:rFonts w:hint="eastAsia" w:ascii="Times New Roman" w:hAnsi="Times New Roman" w:eastAsia="宋体" w:cs="Times New Roman"/>
+          <w:i w:val="0"/>
+          <w:color w:val="000000"/>
+          <w:sz w:val="24"/>
+        </w:rPr>
+        <w:t xml:space="preserve">1. 文件缺失：将 books.json 临时改名后运行，输出"数据文件缺失，请检查 data/books.json"，无崩溃堆栈。</w:t>
+      </w:r>
+    </w:p>
+    <w:p>
+      <w:pPr>
+        <w:pStyle w:val="BodyText"/>
+        <w:ind w:firstLineChars="200" w:firstLine="480"/>
+        <w:spacing w:beforeLines="50" w:afterLines="0" w:line="360" w:lineRule="auto" w:before="120" w:after="0"/>
+        <w:jc w:val="both"/>
+      </w:pPr>
+      <w:r>
+        <w:rPr>
+          <w:rFonts w:hint="eastAsia" w:ascii="Times New Roman" w:hAnsi="Times New Roman" w:eastAsia="宋体" w:cs="Times New Roman"/>
+          <w:i w:val="0"/>
+          <w:color w:val="000000"/>
+          <w:sz w:val="24"/>
+        </w:rPr>
+        <w:t xml:space="preserve">2. 字段缺失：删除首条记录的 borrowCount 字段后运行，程序正常输出（该书借阅量按 0 处理，不影响 Top3）。</w:t>
+      </w:r>
+    </w:p>
+    <w:p>
+      <w:pPr>
+        <w:pStyle w:val="BodyText"/>
+        <w:ind w:firstLineChars="200" w:firstLine="480"/>
+        <w:spacing w:beforeLines="50" w:afterLines="0" w:line="360" w:lineRule="auto" w:before="120" w:after="0"/>
+        <w:jc w:val="both"/>
+      </w:pPr>
+      <w:r>
+        <w:rPr>
+          <w:rFonts w:hint="eastAsia" w:ascii="Times New Roman" w:hAnsi="Times New Roman" w:eastAsia="宋体" w:cs="Times New Roman"/>
+          <w:i w:val="0"/>
+          <w:color w:val="000000"/>
+          <w:sz w:val="24"/>
+        </w:rPr>
+        <w:t xml:space="preserve">3. 类型错误：将首条记录 borrowCount 改为字符串后运行，输出"第 1 条记录字段类型错误，已跳过"，其余 19 条正常统计。</w:t>
+      </w:r>
+    </w:p>
+    <w:p>
+      <w:pPr>
+        <w:pStyle w:val="BodyText"/>
+        <w:ind w:firstLineChars="200" w:firstLine="480"/>
+        <w:spacing w:beforeLines="50" w:afterLines="0" w:line="360" w:lineRule="auto" w:before="120" w:after="0"/>
+        <w:jc w:val="both"/>
+      </w:pPr>
+      <w:r>
+        <w:rPr>
+          <w:rFonts w:hint="eastAsia" w:ascii="Times New Roman" w:hAnsi="Times New Roman" w:eastAsia="宋体" w:cs="Times New Roman"/>
+          <w:i w:val="0"/>
+          <w:color w:val="000000"/>
+          <w:sz w:val="24"/>
+        </w:rPr>
+        <w:t xml:space="preserve">检查点全部通过。</w:t>
+      </w:r>
+    </w:p>
+    <w:p>
+      <w:pPr>
+        <w:pStyle w:val="BodyText"/>
+        <w:ind w:firstLineChars="200" w:firstLine="480"/>
+        <w:spacing w:beforeLines="50" w:afterLines="0" w:line="360" w:lineRule="auto" w:before="120" w:after="0"/>
+        <w:jc w:val="both"/>
+      </w:pPr>
+      <w:r>
+        <w:rPr>
+          <w:rFonts w:hint="eastAsia" w:ascii="Times New Roman" w:hAnsi="Times New Roman" w:eastAsia="宋体" w:cs="Times New Roman"/>
+          <w:i w:val="0"/>
+          <w:color w:val="000000"/>
+          <w:sz w:val="24"/>
+        </w:rPr>
+        <w:t xml:space="preserve">六、问题与调试</w:t>
+      </w:r>
+    </w:p>
+    <w:p>
+      <w:pPr>
+        <w:pStyle w:val="BodyText"/>
+        <w:ind w:firstLineChars="200" w:firstLine="480"/>
+        <w:spacing w:beforeLines="50" w:afterLines="0" w:line="360" w:lineRule="auto" w:before="120" w:after="0"/>
+        <w:jc w:val="both"/>
+      </w:pPr>
+      <w:r>
+        <w:rPr>
+          <w:rFonts w:hint="eastAsia" w:ascii="Times New Roman" w:hAnsi="Times New Roman" w:eastAsia="宋体" w:cs="Times New Roman"/>
+          <w:i w:val="0"/>
+          <w:color w:val="000000"/>
+          <w:sz w:val="24"/>
+        </w:rPr>
+        <w:t xml:space="preserve">问题 1：JSON 数字类型断言失败。</w:t>
+      </w:r>
+    </w:p>
+    <w:p>
+      <w:pPr>
+        <w:pStyle w:val="BodyText"/>
+        <w:ind w:firstLineChars="200" w:firstLine="480"/>
+        <w:spacing w:beforeLines="50" w:afterLines="0" w:line="360" w:lineRule="auto" w:before="120" w:after="0"/>
+        <w:jc w:val="both"/>
+      </w:pPr>
+      <w:r>
+        <w:rPr>
+          <w:rFonts w:hint="eastAsia" w:ascii="Times New Roman" w:hAnsi="Times New Roman" w:eastAsia="宋体" w:cs="Times New Roman"/>
+          <w:i w:val="0"/>
+          <w:color w:val="000000"/>
+          <w:sz w:val="24"/>
+        </w:rPr>
+        <w:t xml:space="preserve">现象：最初 fromJson 使用 j['borrowCount'] as int，当 JSON 中数字为 10.0（double）时抛出 TypeError。</w:t>
+      </w:r>
+    </w:p>
+    <w:p>
+      <w:pPr>
+        <w:pStyle w:val="BodyText"/>
+        <w:ind w:firstLineChars="200" w:firstLine="480"/>
+        <w:spacing w:beforeLines="50" w:afterLines="0" w:line="360" w:lineRule="auto" w:before="120" w:after="0"/>
+        <w:jc w:val="both"/>
+      </w:pPr>
+      <w:r>
+        <w:rPr>
+          <w:rFonts w:hint="eastAsia" w:ascii="Times New Roman" w:hAnsi="Times New Roman" w:eastAsia="宋体" w:cs="Times New Roman"/>
+          <w:i w:val="0"/>
+          <w:color w:val="000000"/>
+          <w:sz w:val="24"/>
+        </w:rPr>
+        <w:t xml:space="preserve">定位：Dart 的 jsonDecode 对不带小数点的数字解析为 int，带小数点的解析为 double，直接 as int 在 double 情况下失败。</w:t>
+      </w:r>
+    </w:p>
+    <w:p>
+      <w:pPr>
+        <w:pStyle w:val="BodyText"/>
+        <w:ind w:firstLineChars="200" w:firstLine="480"/>
+        <w:spacing w:beforeLines="50" w:afterLines="0" w:line="360" w:lineRule="auto" w:before="120" w:after="0"/>
+        <w:jc w:val="both"/>
+      </w:pPr>
+      <w:r>
+        <w:rPr>
+          <w:rFonts w:hint="eastAsia" w:ascii="Times New Roman" w:hAnsi="Times New Roman" w:eastAsia="宋体" w:cs="Times New Roman"/>
+          <w:i w:val="0"/>
+          <w:color w:val="000000"/>
+          <w:sz w:val="24"/>
+        </w:rPr>
+        <w:t xml:space="preserve">解决：改为 (j['borrowCount'] as num).toInt()，用 num 同时兼容 int 和 double，再统一转 int。鲁棒版进一步加 ? 和 ?? 0 处理缺失。验证：单元测试"数字字段兼容 double 输入"通过。</w:t>
+      </w:r>
+    </w:p>
+    <w:p>
+      <w:pPr>
+        <w:pStyle w:val="BodyText"/>
+        <w:ind w:firstLineChars="200" w:firstLine="480"/>
+        <w:spacing w:beforeLines="50" w:afterLines="0" w:line="360" w:lineRule="auto" w:before="120" w:after="0"/>
+        <w:jc w:val="both"/>
+      </w:pPr>
+      <w:r>
+        <w:rPr>
+          <w:rFonts w:hint="eastAsia" w:ascii="Times New Roman" w:hAnsi="Times New Roman" w:eastAsia="宋体" w:cs="Times New Roman"/>
+          <w:i w:val="0"/>
+          <w:color w:val="000000"/>
+          <w:sz w:val="24"/>
+        </w:rPr>
+        <w:t xml:space="preserve">问题 2：异步函数中忘了写 await。</w:t>
+      </w:r>
+    </w:p>
+    <w:p>
+      <w:pPr>
+        <w:pStyle w:val="BodyText"/>
+        <w:ind w:firstLineChars="200" w:firstLine="480"/>
+        <w:spacing w:beforeLines="50" w:afterLines="0" w:line="360" w:lineRule="auto" w:before="120" w:after="0"/>
+        <w:jc w:val="both"/>
+      </w:pPr>
+      <w:r>
+        <w:rPr>
+          <w:rFonts w:hint="eastAsia" w:ascii="Times New Roman" w:hAnsi="Times New Roman" w:eastAsia="宋体" w:cs="Times New Roman"/>
+          <w:i w:val="0"/>
+          <w:color w:val="000000"/>
+          <w:sz w:val="24"/>
+        </w:rPr>
+        <w:t xml:space="preserve">现象：初次写 main 时漏写 await file.readAsString()，拿到的是 Future&lt;String&gt; 而非 String，jsonDecode 报错。</w:t>
+      </w:r>
+    </w:p>
+    <w:p>
+      <w:pPr>
+        <w:pStyle w:val="BodyText"/>
+        <w:ind w:firstLineChars="200" w:firstLine="480"/>
+        <w:spacing w:beforeLines="50" w:afterLines="0" w:line="360" w:lineRule="auto" w:before="120" w:after="0"/>
+        <w:jc w:val="both"/>
+      </w:pPr>
+      <w:r>
+        <w:rPr>
+          <w:rFonts w:hint="eastAsia" w:ascii="Times New Roman" w:hAnsi="Times New Roman" w:eastAsia="宋体" w:cs="Times New Roman"/>
+          <w:i w:val="0"/>
+          <w:color w:val="000000"/>
+          <w:sz w:val="24"/>
+        </w:rPr>
+        <w:t xml:space="preserve">定位：这是指南提到的本课最高频错误——"忘了写 await 导致拿到 Future 而不是值"。</w:t>
+      </w:r>
+    </w:p>
+    <w:p>
+      <w:pPr>
+        <w:pStyle w:val="BodyText"/>
+        <w:ind w:firstLineChars="200" w:firstLine="480"/>
+        <w:spacing w:beforeLines="50" w:afterLines="0" w:line="360" w:lineRule="auto" w:before="120" w:after="0"/>
+        <w:jc w:val="both"/>
+      </w:pPr>
+      <w:r>
+        <w:rPr>
+          <w:rFonts w:hint="eastAsia" w:ascii="Times New Roman" w:hAnsi="Times New Roman" w:eastAsia="宋体" w:cs="Times New Roman"/>
+          <w:i w:val="0"/>
+          <w:color w:val="000000"/>
+          <w:sz w:val="24"/>
+        </w:rPr>
+        <w:t xml:space="preserve">解决：在所有异步调用前加 await，并确保 main 标记为 async。验证：加上 await 后正常解析。</w:t>
+      </w:r>
+    </w:p>
+    <w:p>
+      <w:pPr>
+        <w:pStyle w:val="BodyText"/>
+        <w:ind w:firstLineChars="200" w:firstLine="480"/>
+        <w:spacing w:beforeLines="50" w:afterLines="0" w:line="360" w:lineRule="auto" w:before="120" w:after="0"/>
+        <w:jc w:val="both"/>
+      </w:pPr>
+      <w:r>
+        <w:rPr>
+          <w:rFonts w:hint="eastAsia" w:ascii="Times New Roman" w:hAnsi="Times New Roman" w:eastAsia="宋体" w:cs="Times New Roman"/>
+          <w:i w:val="0"/>
+          <w:color w:val="000000"/>
+          <w:sz w:val="24"/>
+        </w:rPr>
+        <w:t xml:space="preserve">七、AI使用记录</w:t>
+      </w:r>
+    </w:p>
+    <w:p>
+      <w:pPr>
+        <w:pStyle w:val="BodyText"/>
+        <w:ind w:firstLineChars="200" w:firstLine="480"/>
+        <w:spacing w:beforeLines="50" w:afterLines="0" w:line="360" w:lineRule="auto" w:before="120" w:after="0"/>
+        <w:jc w:val="both"/>
+      </w:pPr>
+      <w:r>
+        <w:rPr>
+          <w:rFonts w:hint="eastAsia" w:ascii="Times New Roman" w:hAnsi="Times New Roman" w:eastAsia="宋体" w:cs="Times New Roman"/>
+          <w:i w:val="0"/>
+          <w:color w:val="000000"/>
+          <w:sz w:val="24"/>
+        </w:rPr>
+        <w:t xml:space="preserve">1. 用途：生成 Book 模型类；指令摘要：实现 fromJson/toJson，处理数字类型；输出：模型类代码；验证方式：dart test 单元测试通过。</w:t>
+      </w:r>
+    </w:p>
+    <w:p>
+      <w:pPr>
+        <w:pStyle w:val="BodyText"/>
+        <w:ind w:firstLineChars="200" w:firstLine="480"/>
+        <w:spacing w:beforeLines="50" w:afterLines="0" w:line="360" w:lineRule="auto" w:before="120" w:after="0"/>
+        <w:jc w:val="both"/>
+      </w:pPr>
+      <w:r>
+        <w:rPr>
+          <w:rFonts w:hint="eastAsia" w:ascii="Times New Roman" w:hAnsi="Times New Roman" w:eastAsia="宋体" w:cs="Times New Roman"/>
+          <w:i w:val="0"/>
+          <w:color w:val="000000"/>
+          <w:sz w:val="24"/>
+        </w:rPr>
+        <w:t xml:space="preserve">2. 用途：生成 main 异步读取逻辑；指令摘要：异步读取 JSON 并统计；输出：main 函数代码；验证方式：dart run 输出正确。</w:t>
+      </w:r>
+    </w:p>
+    <w:p>
+      <w:pPr>
+        <w:pStyle w:val="BodyText"/>
+        <w:ind w:firstLineChars="200" w:firstLine="480"/>
+        <w:spacing w:beforeLines="50" w:afterLines="0" w:line="360" w:lineRule="auto" w:before="120" w:after="0"/>
+        <w:jc w:val="both"/>
+      </w:pPr>
+      <w:r>
+        <w:rPr>
+          <w:rFonts w:hint="eastAsia" w:ascii="Times New Roman" w:hAnsi="Times New Roman" w:eastAsia="宋体" w:cs="Times New Roman"/>
+          <w:i w:val="0"/>
+          <w:color w:val="000000"/>
+          <w:sz w:val="24"/>
+        </w:rPr>
+        <w:t xml:space="preserve">3. 用途：异常处理增强；指令摘要：文件缺失、字段缺失、类型错误兜底；输出：try-catch 分层代码；验证方式：三条异常路径手动测试。</w:t>
+      </w:r>
+    </w:p>
+    <w:p>
+      <w:pPr>
+        <w:pStyle w:val="BodyText"/>
+        <w:ind w:firstLineChars="200" w:firstLine="480"/>
+        <w:spacing w:beforeLines="50" w:afterLines="0" w:line="360" w:lineRule="auto" w:before="120" w:after="0"/>
+        <w:jc w:val="both"/>
+      </w:pPr>
+      <w:r>
+        <w:rPr>
+          <w:rFonts w:hint="eastAsia" w:ascii="Times New Roman" w:hAnsi="Times New Roman" w:eastAsia="宋体" w:cs="Times New Roman"/>
+          <w:i w:val="0"/>
+          <w:color w:val="000000"/>
+          <w:sz w:val="24"/>
+        </w:rPr>
+        <w:t xml:space="preserve">4. 用途：异步计时实验；指令摘要：串行 await vs Future.wait 计时；输出：实验脚本；验证方式：实际运行串行 3035ms、并行 1009ms。</w:t>
+      </w:r>
+    </w:p>
+    <w:p>
+      <w:pPr>
+        <w:pStyle w:val="BodyText"/>
+        <w:ind w:firstLineChars="200" w:firstLine="480"/>
+        <w:spacing w:beforeLines="50" w:afterLines="0" w:line="360" w:lineRule="auto" w:before="120" w:after="0"/>
+        <w:jc w:val="both"/>
+      </w:pPr>
+      <w:r>
+        <w:rPr>
+          <w:rFonts w:hint="eastAsia" w:ascii="Times New Roman" w:hAnsi="Times New Roman" w:eastAsia="宋体" w:cs="Times New Roman"/>
+          <w:i w:val="0"/>
+          <w:color w:val="000000"/>
+          <w:sz w:val="24"/>
+        </w:rPr>
+        <w:t xml:space="preserve">5. 用途：单元测试编写；指令摘要：fromJson/roundtrip/缺失字段/double 兼容；输出：4 个测试用例；验证方式：dart test 全部通过。</w:t>
+      </w:r>
+    </w:p>
+    <w:p>
+      <w:pPr>
+        <w:pStyle w:val="BodyText"/>
+        <w:ind w:firstLineChars="200" w:firstLine="480"/>
+        <w:spacing w:beforeLines="50" w:afterLines="0" w:line="360" w:lineRule="auto" w:before="120" w:after="0"/>
+        <w:jc w:val="both"/>
+      </w:pPr>
+      <w:r>
+        <w:rPr>
+          <w:rFonts w:hint="eastAsia" w:ascii="Times New Roman" w:hAnsi="Times New Roman" w:eastAsia="宋体" w:cs="Times New Roman"/>
+          <w:i w:val="0"/>
+          <w:color w:val="000000"/>
+          <w:sz w:val="24"/>
+        </w:rPr>
+        <w:t xml:space="preserve">八、证据截图</w:t>
+      </w:r>
+    </w:p>
+    <w:p>
+      <w:pPr>
+        <w:pStyle w:val="BodyText"/>
+        <w:ind w:firstLineChars="200" w:firstLine="480"/>
+        <w:spacing w:beforeLines="50" w:afterLines="0" w:line="360" w:lineRule="auto" w:before="120" w:after="0"/>
+        <w:jc w:val="both"/>
+      </w:pPr>
+      <w:r>
+        <w:rPr>
+          <w:rFonts w:hint="eastAsia" w:ascii="Times New Roman" w:hAnsi="Times New Roman" w:eastAsia="宋体" w:cs="Times New Roman"/>
+          <w:i w:val="0"/>
+          <w:color w:val="000000"/>
+          <w:sz w:val="24"/>
+        </w:rPr>
+        <w:t xml:space="preserve">（按要求本次不附截图，运行结果与 Git 提交记录见上文文字描述及仓库提交历史。）</w:t>
+      </w:r>
+    </w:p>
+    <w:p>
+      <w:pPr>
+        <w:pStyle w:val="BodyText"/>
+        <w:ind w:firstLineChars="200" w:firstLine="480"/>
+        <w:spacing w:beforeLines="50" w:afterLines="0" w:line="360" w:lineRule="auto" w:before="120" w:after="0"/>
+        <w:jc w:val="both"/>
+      </w:pPr>
+      <w:r>
+        <w:rPr>
+          <w:rFonts w:hint="eastAsia" w:ascii="Times New Roman" w:hAnsi="Times New Roman" w:eastAsia="宋体" w:cs="Times New Roman"/>
+          <w:i w:val="0"/>
+          <w:color w:val="000000"/>
+          <w:sz w:val="24"/>
+        </w:rPr>
+        <w:t xml:space="preserve">九、自评</w:t>
+      </w:r>
+    </w:p>
+    <w:p>
+      <w:pPr>
+        <w:pStyle w:val="BodyText"/>
+        <w:ind w:firstLineChars="200" w:firstLine="480"/>
+        <w:spacing w:beforeLines="50" w:afterLines="0" w:line="360" w:lineRule="auto" w:before="120" w:after="0"/>
+        <w:jc w:val="both"/>
+      </w:pPr>
+      <w:r>
+        <w:rPr>
+          <w:rFonts w:hint="eastAsia" w:ascii="Times New Roman" w:hAnsi="Times New Roman" w:eastAsia="宋体" w:cs="Times New Roman"/>
+          <w:i w:val="0"/>
+          <w:color w:val="000000"/>
+          <w:sz w:val="24"/>
+        </w:rPr>
+        <w:t xml:space="preserve">1. async_json 完整复现：已完成，正常路径统计正确。</w:t>
+      </w:r>
+    </w:p>
+    <w:p>
+      <w:pPr>
+        <w:pStyle w:val="BodyText"/>
+        <w:ind w:firstLineChars="200" w:firstLine="480"/>
+        <w:spacing w:beforeLines="50" w:afterLines="0" w:line="360" w:lineRule="auto" w:before="120" w:after="0"/>
+        <w:jc w:val="both"/>
+      </w:pPr>
+      <w:r>
+        <w:rPr>
+          <w:rFonts w:hint="eastAsia" w:ascii="Times New Roman" w:hAnsi="Times New Roman" w:eastAsia="宋体" w:cs="Times New Roman"/>
+          <w:i w:val="0"/>
+          <w:color w:val="000000"/>
+          <w:sz w:val="24"/>
+        </w:rPr>
+        <w:t xml:space="preserve">2. 检查点（正常/异常两路）：已完成，三条异常路径均友好提示。</w:t>
+      </w:r>
+    </w:p>
+    <w:p>
+      <w:pPr>
+        <w:pStyle w:val="BodyText"/>
+        <w:ind w:firstLineChars="200" w:firstLine="480"/>
+        <w:spacing w:beforeLines="50" w:afterLines="0" w:line="360" w:lineRule="auto" w:before="120" w:after="0"/>
+        <w:jc w:val="both"/>
+      </w:pPr>
+      <w:r>
+        <w:rPr>
+          <w:rFonts w:hint="eastAsia" w:ascii="Times New Roman" w:hAnsi="Times New Roman" w:eastAsia="宋体" w:cs="Times New Roman"/>
+          <w:i w:val="0"/>
+          <w:color w:val="000000"/>
+          <w:sz w:val="24"/>
+        </w:rPr>
+        <w:t xml:space="preserve">3. async/await 改写嵌套回调：已完成，callback_to_async.dart 两版输出一致。</w:t>
+      </w:r>
+    </w:p>
+    <w:p>
+      <w:pPr>
+        <w:pStyle w:val="BodyText"/>
+        <w:ind w:firstLineChars="200" w:firstLine="480"/>
+        <w:spacing w:beforeLines="50" w:afterLines="0" w:line="360" w:lineRule="auto" w:before="120" w:after="0"/>
+        <w:jc w:val="both"/>
+      </w:pPr>
+      <w:r>
+        <w:rPr>
+          <w:rFonts w:hint="eastAsia" w:ascii="Times New Roman" w:hAnsi="Times New Roman" w:eastAsia="宋体" w:cs="Times New Roman"/>
+          <w:i w:val="0"/>
+          <w:color w:val="000000"/>
+          <w:sz w:val="24"/>
+        </w:rPr>
+        <w:t xml:space="preserve">4. 异常兜底（文件/字段/类型）：已完成，分层 try-catch。</w:t>
+      </w:r>
+    </w:p>
+    <w:p>
+      <w:pPr>
+        <w:pStyle w:val="BodyText"/>
+        <w:ind w:firstLineChars="200" w:firstLine="480"/>
+        <w:spacing w:beforeLines="50" w:afterLines="0" w:line="360" w:lineRule="auto" w:before="120" w:after="0"/>
+        <w:jc w:val="both"/>
+      </w:pPr>
+      <w:r>
+        <w:rPr>
+          <w:rFonts w:hint="eastAsia" w:ascii="Times New Roman" w:hAnsi="Times New Roman" w:eastAsia="宋体" w:cs="Times New Roman"/>
+          <w:i w:val="0"/>
+          <w:color w:val="000000"/>
+          <w:sz w:val="24"/>
+        </w:rPr>
+        <w:t xml:space="preserve">5. JSON 解析为类 + toJson roundtrip：已完成，单元测试验证一致。</w:t>
+      </w:r>
+    </w:p>
+    <w:p>
+      <w:pPr>
+        <w:pStyle w:val="BodyText"/>
+        <w:ind w:firstLineChars="200" w:firstLine="480"/>
+        <w:spacing w:beforeLines="50" w:afterLines="0" w:line="360" w:lineRule="auto" w:before="120" w:after="0"/>
+        <w:jc w:val="both"/>
+      </w:pPr>
+      <w:r>
+        <w:rPr>
+          <w:rFonts w:hint="eastAsia" w:ascii="Times New Roman" w:hAnsi="Times New Roman" w:eastAsia="宋体" w:cs="Times New Roman"/>
+          <w:i w:val="0"/>
+          <w:color w:val="000000"/>
+          <w:sz w:val="24"/>
+        </w:rPr>
+        <w:t xml:space="preserve">6. pubspec 规范（^ 约束 + lock 文件）：已完成，path: ^1.9.1，lock 已提交。</w:t>
+      </w:r>
+    </w:p>
+    <w:p>
+      <w:pPr>
+        <w:pStyle w:val="BodyText"/>
+        <w:ind w:firstLineChars="200" w:firstLine="480"/>
+        <w:spacing w:beforeLines="50" w:afterLines="0" w:line="360" w:lineRule="auto" w:before="120" w:after="0"/>
+        <w:jc w:val="both"/>
+      </w:pPr>
+      <w:r>
+        <w:rPr>
+          <w:rFonts w:hint="eastAsia" w:ascii="Times New Roman" w:hAnsi="Times New Roman" w:eastAsia="宋体" w:cs="Times New Roman"/>
+          <w:i w:val="0"/>
+          <w:color w:val="000000"/>
+          <w:sz w:val="24"/>
+        </w:rPr>
+        <w:t xml:space="preserve">7. Git 规范（3 次以上提交）：已完成，共 5 次提交。</w:t>
+      </w:r>
+    </w:p>
+    <w:p>
+      <w:pPr>
+        <w:pStyle w:val="BodyText"/>
+        <w:ind w:firstLineChars="200" w:firstLine="480"/>
+        <w:spacing w:beforeLines="50" w:afterLines="0" w:line="360" w:lineRule="auto" w:before="120" w:after="0"/>
+        <w:jc w:val="both"/>
+      </w:pPr>
+      <w:r>
+        <w:rPr>
+          <w:rFonts w:hint="eastAsia" w:ascii="Times New Roman" w:hAnsi="Times New Roman" w:eastAsia="宋体" w:cs="Times New Roman"/>
+          <w:i w:val="0"/>
+          <w:color w:val="000000"/>
+          <w:sz w:val="24"/>
+        </w:rPr>
+        <w:t xml:space="preserve">8. 报告记录：已完成。</w:t>
+      </w:r>
+    </w:p>
+    <w:p>
+      <w:pPr>
+        <w:pStyle w:val="BodyText"/>
+        <w:ind w:firstLineChars="200" w:firstLine="480"/>
+        <w:spacing w:beforeLines="50" w:afterLines="0" w:line="360" w:lineRule="auto" w:before="120" w:after="0"/>
+        <w:jc w:val="both"/>
+      </w:pPr>
+      <w:r>
+        <w:rPr>
+          <w:rFonts w:hint="eastAsia" w:ascii="Times New Roman" w:hAnsi="Times New Roman" w:eastAsia="宋体" w:cs="Times New Roman"/>
+          <w:i w:val="0"/>
+          <w:color w:val="000000"/>
+          <w:sz w:val="24"/>
+        </w:rPr>
+        <w:t xml:space="preserve">十、一句话收获与下一步计划</w:t>
+      </w:r>
+    </w:p>
+    <w:p>
+      <w:pPr>
+        <w:pStyle w:val="BodyText"/>
+        <w:ind w:firstLineChars="200" w:firstLine="480"/>
+        <w:spacing w:beforeLines="50" w:afterLines="0" w:line="360" w:lineRule="auto" w:before="120" w:after="0"/>
+        <w:jc w:val="both"/>
+      </w:pPr>
+      <w:r>
+        <w:rPr>
+          <w:rFonts w:hint="eastAsia" w:ascii="Times New Roman" w:hAnsi="Times New Roman" w:eastAsia="宋体" w:cs="Times New Roman"/>
+          <w:i w:val="0"/>
+          <w:color w:val="000000"/>
+          <w:sz w:val="24"/>
+        </w:rPr>
+        <w:t xml:space="preserve">一句话收获：Dart 的异步本质是单线程事件循环，await 让出执行权而非阻塞线程；Future.wait 是并行利器，异常处理要做到"不裸抛、有兜底"。</w:t>
+      </w:r>
+    </w:p>
+    <w:p>
+      <w:pPr>
+        <w:pStyle w:val="BodyText"/>
+        <w:ind w:firstLineChars="200" w:firstLine="480"/>
+        <w:spacing w:beforeLines="50" w:afterLines="0" w:line="360" w:lineRule="auto" w:before="120" w:after="0"/>
+        <w:jc w:val="both"/>
+      </w:pPr>
+      <w:r>
+        <w:rPr>
+          <w:rFonts w:hint="eastAsia" w:ascii="Times New Roman" w:hAnsi="Times New Roman" w:eastAsia="宋体" w:cs="Times New Roman"/>
+          <w:i w:val="0"/>
+          <w:color w:val="000000"/>
+          <w:sz w:val="24"/>
+        </w:rPr>
+        <w:t xml:space="preserve">下一步计划：预习第 11 课网络请求，本课的异步 + JSON + 包管理将直接复用；深入学习 Stream 的更多操作符（map、where、transform）和 Isolate 的使用场景。</w:t>
       </w:r>
     </w:p>
     <w:bookmarkEnd w:id="9"/>
@@ -247,11 +1616,61 @@
 </w:document>
 </file>
 
-<file path=word/comments.xml><?xml version="1.0" encoding="utf-8"?>
-<w:comments xmlns:w="http://schemas.openxmlformats.org/wordprocessingml/2006/main" xmlns:m="http://schemas.openxmlformats.org/officeDocument/2006/math" xmlns:r="http://schemas.openxmlformats.org/officeDocument/2006/relationships" xmlns:o="urn:schemas-microsoft-com:office:office" xmlns:v="urn:schemas-microsoft-com:vml" xmlns:w10="urn:schemas-microsoft-com:office:word" xmlns:a="http://schemas.openxmlformats.org/drawingml/2006/main" xmlns:pic="http://schemas.openxmlformats.org/drawingml/2006/picture" xmlns:wp="http://schemas.openxmlformats.org/drawingml/2006/wordprocessingDrawing"/>
+<file path=word\fontTable.xml><?xml version="1.0" encoding="utf-8"?>
+<w:fonts xmlns:r="http://schemas.openxmlformats.org/officeDocument/2006/relationships" xmlns:w="http://schemas.openxmlformats.org/wordprocessingml/2006/main">
+  <w:font w:name="Aptos">
+    <w:panose1 w:val="020B0004020202020204"/>
+    <w:charset w:val="00"/>
+    <w:family w:val="swiss"/>
+    <w:pitch w:val="variable"/>
+    <w:sig w:usb0="20000287" w:usb1="00000003" w:usb2="00000000" w:usb3="00000000" w:csb0="0000019F" w:csb1="00000000"/>
+  </w:font>
+  <w:font w:name="Times New Roman">
+    <w:panose1 w:val="02020603050405020304"/>
+    <w:charset w:val="00"/>
+    <w:family w:val="roman"/>
+    <w:pitch w:val="variable"/>
+    <w:sig w:usb0="E0002EFF" w:usb1="C000785B" w:usb2="00000009" w:usb3="00000000" w:csb0="000001FF" w:csb1="00000000"/>
+  </w:font>
+  <w:font w:name="Aptos Display">
+    <w:panose1 w:val="020B0004020202020204"/>
+    <w:charset w:val="00"/>
+    <w:family w:val="swiss"/>
+    <w:pitch w:val="variable"/>
+    <w:sig w:usb0="20000287" w:usb1="00000003" w:usb2="00000000" w:usb3="00000000" w:csb0="0000019F" w:csb1="00000000"/>
+  </w:font>
+  <w:font w:name="Cambria Math">
+    <w:panose1 w:val="02040503050406030204"/>
+    <w:charset w:val="00"/>
+    <w:family w:val="roman"/>
+    <w:pitch w:val="variable"/>
+    <w:sig w:usb0="E00002FF" w:usb1="420024FF" w:usb2="00000000" w:usb3="00000000" w:csb0="0000019F" w:csb1="00000000"/>
+  </w:font>
+  <w:font w:name="Courier New">
+    <w:panose1 w:val="02070309020205020404"/>
+    <w:charset w:val="00"/>
+    <w:family w:val="modern"/>
+    <w:pitch w:val="fixed"/>
+    <w:sig w:usb0="E0002AFF" w:usb1="C0007843" w:usb2="00000009" w:usb3="00000000" w:csb0="000001FF" w:csb1="00000000"/>
+  </w:font>
+  <w:font w:name="Cambria">
+    <w:panose1 w:val="02040503050406030204"/>
+    <w:charset w:val="00"/>
+    <w:family w:val="roman"/>
+    <w:pitch w:val="variable"/>
+    <w:sig w:usb0="E00002FF" w:usb1="400004FF" w:usb2="00000000" w:usb3="00000000" w:csb0="0000019F" w:csb1="00000000"/>
+  </w:font>
+  <w:font w:name="Calibri">
+    <w:panose1 w:val="020F0502020204030204"/>
+    <w:charset w:val="00"/>
+    <w:family w:val="swiss"/>
+    <w:pitch w:val="variable"/>
+    <w:sig w:usb0="E0002AFF" w:usb1="C000247B" w:usb2="00000009" w:usb3="00000000" w:csb0="000001FF" w:csb1="00000000"/>
+  </w:font>
+</w:fonts>
 </file>
 
-<file path=word/footer1.xml><?xml version="1.0" encoding="utf-8"?>
+<file path=word\footer1.xml><?xml version="1.0" encoding="utf-8"?>
 <w:ftr xmlns:m="http://schemas.openxmlformats.org/officeDocument/2006/math" xmlns:mc="http://schemas.openxmlformats.org/markup-compatibility/2006" xmlns:mo="http://schemas.microsoft.com/office/mac/office/2008/main" xmlns:mv="urn:schemas-microsoft-com:mac:vml" xmlns:o="urn:schemas-microsoft-com:office:office" xmlns:r="http://schemas.openxmlformats.org/officeDocument/2006/relationships" xmlns:v="urn:schemas-microsoft-com:vml" xmlns:w10="urn:schemas-microsoft-com:office:word" xmlns:w14="http://schemas.microsoft.com/office/word/2010/wordml" xmlns:w="http://schemas.openxmlformats.org/wordprocessingml/2006/main" xmlns:wne="http://schemas.microsoft.com/office/word/2006/wordml" xmlns:wp14="http://schemas.microsoft.com/office/word/2010/wordprocessingDrawing" xmlns:wp="http://schemas.openxmlformats.org/drawingml/2006/wordprocessingDrawing" xmlns:wpc="http://schemas.microsoft.com/office/word/2010/wordprocessingCanvas" xmlns:wpg="http://schemas.microsoft.com/office/word/2010/wordprocessingGroup" xmlns:wpi="http://schemas.microsoft.com/office/word/2010/wordprocessingInk" xmlns:wps="http://schemas.microsoft.com/office/word/2010/wordprocessingShape" mc:Ignorable="w14 wp14">
   <w:p>
     <w:pPr>
@@ -286,7 +1705,7 @@
 </w:ftr>
 </file>
 
-<file path=word/footnotes.xml><?xml version="1.0" encoding="utf-8"?>
+<file path=word\footnotes.xml><?xml version="1.0" encoding="utf-8"?>
 <w:footnotes xmlns:w="http://schemas.openxmlformats.org/wordprocessingml/2006/main" xmlns:m="http://schemas.openxmlformats.org/officeDocument/2006/math" xmlns:r="http://schemas.openxmlformats.org/officeDocument/2006/relationships" xmlns:o="urn:schemas-microsoft-com:office:office" xmlns:v="urn:schemas-microsoft-com:vml" xmlns:w10="urn:schemas-microsoft-com:office:word" xmlns:a="http://schemas.openxmlformats.org/drawingml/2006/main" xmlns:pic="http://schemas.openxmlformats.org/drawingml/2006/picture" xmlns:wp="http://schemas.openxmlformats.org/drawingml/2006/wordprocessingDrawing">
   <w:footnote w:type="continuationSeparator" w:id="0">
     <w:p>
@@ -305,7 +1724,7 @@
 </w:footnotes>
 </file>
 
-<file path=word/numbering.xml><?xml version="1.0" encoding="utf-8"?>
+<file path=word\numbering.xml><?xml version="1.0" encoding="utf-8"?>
 <w:numbering xmlns:w="http://schemas.openxmlformats.org/wordprocessingml/2006/main">
   <w:abstractNum w:abstractNumId="990">
     <w:nsid w:val="0000A990"/>
@@ -389,7 +1808,30 @@
 </w:numbering>
 </file>
 
-<file path=word/styles.xml><?xml version="1.0" encoding="utf-8"?>
+<file path=word\settings.xml><?xml version="1.0" encoding="utf-8"?>
+<w:settings xmlns:m="http://schemas.openxmlformats.org/officeDocument/2006/math" xmlns:o="urn:schemas-microsoft-com:office:office" xmlns:r="http://schemas.openxmlformats.org/officeDocument/2006/relationships" xmlns:sl="http://schemas.openxmlformats.org/schemaLibrary/2006/main" xmlns:v="urn:schemas-microsoft-com:vml" xmlns:w="http://schemas.openxmlformats.org/wordprocessingml/2006/main" xmlns:w10="urn:schemas-microsoft-com:office:word">
+  <w:zoom w:percent="100"/>
+  <w:embedSystemFonts/>
+  <w:proofState w:grammar="clean" w:spelling="clean"/>
+  <w:stylePaneFormatFilter w:val="0004"/>
+  <w:doNotTrackMoves/>
+  <w:defaultTabStop w:val="720"/>
+  <w:drawingGridHorizontalSpacing w:val="360"/>
+  <w:drawingGridVerticalSpacing w:val="360"/>
+  <w:displayHorizontalDrawingGridEvery w:val="0"/>
+  <w:displayVerticalDrawingGridEvery w:val="0"/>
+  <w:characterSpacingControl w:val="doNotCompress"/>
+  <w:savePreviewPicture/>
+  <w:rsids>
+  </w:rsids>
+  <w:themeFontLang w:val="en-US"/>
+  <w:clrSchemeMapping w:accent1="accent1" w:accent2="accent2" w:accent3="accent3" w:accent4="accent4" w:accent5="accent5" w:accent6="accent6" w:bg1="light1" w:bg2="light2" w:followedHyperlink="followedHyperlink" w:hyperlink="hyperlink" w:t1="dark1" w:t2="dark2"/>
+  <w:decimalSymbol w:val="."/>
+  <w:listSeparator w:val=","/>
+</w:settings>
+</file>
+
+<file path=word\styles.xml><?xml version="1.0" encoding="utf-8"?>
 <w:styles xmlns:r="http://schemas.openxmlformats.org/officeDocument/2006/relationships" xmlns:w="http://schemas.openxmlformats.org/wordprocessingml/2006/main">
   <w:docDefaults>
     <w:rPrDefault>
@@ -1337,7 +2779,7 @@
 </w:styles>
 </file>
 
-<file path=word/theme/theme1.xml><?xml version="1.0" encoding="utf-8"?>
+<file path=word\theme\theme1.xml><?xml version="1.0" encoding="utf-8"?>
 <a:theme xmlns:a="http://schemas.openxmlformats.org/drawingml/2006/main" name="Office Theme">
   <a:themeElements>
     <a:clrScheme name="Office">
@@ -1630,4 +3072,11 @@
     </a:ext>
   </a:extLst>
 </a:theme>
+</file>
+
+<file path=word\webSettings.xml><?xml version="1.0" encoding="utf-8"?>
+<ns0:webSettings xmlns:ns0="http://schemas.openxmlformats.org/wordprocessingml/2006/main">
+  <ns0:allowPNG/>
+  <ns0:doNotSaveAsSingleFile/>
+</ns0:webSettings>
 </file>
</xml_diff>